<commit_message>
docs: retain report structure with refined typography
</commit_message>
<xml_diff>
--- a/docs/EARNSCORE_SUBMISSION_FINAL.docx
+++ b/docs/EARNSCORE_SUBMISSION_FINAL.docx
@@ -2,7 +2,7 @@
 <file path=word/document.xml><?xml version="1.0" encoding="utf-8"?>
 <w:document xmlns:w="http://schemas.openxmlformats.org/wordprocessingml/2006/main" xmlns:m="http://schemas.openxmlformats.org/officeDocument/2006/math" xmlns:r="http://schemas.openxmlformats.org/officeDocument/2006/relationships" xmlns:o="urn:schemas-microsoft-com:office:office" xmlns:v="urn:schemas-microsoft-com:vml" xmlns:w10="urn:schemas-microsoft-com:office:word" xmlns:a="http://schemas.openxmlformats.org/drawingml/2006/main" xmlns:pic="http://schemas.openxmlformats.org/drawingml/2006/picture" xmlns:wp="http://schemas.openxmlformats.org/drawingml/2006/wordprocessingDrawing">
   <w:body>
-    <w:bookmarkStart w:id="73" w:name="earnscore"/>
+    <w:bookmarkStart w:id="72" w:name="earnscore"/>
     <w:p>
       <w:pPr>
         <w:pStyle w:val="Heading1"/>
@@ -39,7 +39,73 @@
     <w:p>
       <w:pPr>
         <w:pStyle w:val="FirstParagraph"/>
-        <w:spacing w:after="40"/>
+        <w:spacing w:after="20"/>
+        <w:jc w:val="center"/>
+      </w:pPr>
+      <w:r>
+        <w:rPr>
+          <w:rFonts w:ascii="Aptos" w:hAnsi="Aptos" w:eastAsia="Aptos"/>
+          <w:b/>
+          <w:bCs/>
+          <w:color w:val="667085"/>
+          <w:sz w:val="18"/>
+        </w:rPr>
+        <w:t xml:space="preserve">Category:</w:t>
+      </w:r>
+      <w:r>
+        <w:rPr>
+          <w:rFonts w:ascii="Aptos" w:hAnsi="Aptos" w:eastAsia="Aptos"/>
+          <w:color w:val="667085"/>
+          <w:sz w:val="18"/>
+        </w:rPr>
+        <w:t xml:space="preserve"> </w:t>
+      </w:r>
+      <w:r>
+        <w:rPr>
+          <w:rFonts w:ascii="Aptos" w:hAnsi="Aptos" w:eastAsia="Aptos"/>
+          <w:color w:val="667085"/>
+          <w:sz w:val="18"/>
+        </w:rPr>
+        <w:t xml:space="preserve">FinTech</w:t>
+      </w:r>
+    </w:p>
+    <w:p>
+      <w:pPr>
+        <w:pStyle w:val="BodyText"/>
+        <w:spacing w:after="20"/>
+        <w:jc w:val="center"/>
+      </w:pPr>
+      <w:r>
+        <w:rPr>
+          <w:rFonts w:ascii="Aptos" w:hAnsi="Aptos" w:eastAsia="Aptos"/>
+          <w:b/>
+          <w:bCs/>
+          <w:color w:val="667085"/>
+          <w:sz w:val="18"/>
+        </w:rPr>
+        <w:t xml:space="preserve">Secondary domain:</w:t>
+      </w:r>
+      <w:r>
+        <w:rPr>
+          <w:rFonts w:ascii="Aptos" w:hAnsi="Aptos" w:eastAsia="Aptos"/>
+          <w:color w:val="667085"/>
+          <w:sz w:val="18"/>
+        </w:rPr>
+        <w:t xml:space="preserve"> </w:t>
+      </w:r>
+      <w:r>
+        <w:rPr>
+          <w:rFonts w:ascii="Aptos" w:hAnsi="Aptos" w:eastAsia="Aptos"/>
+          <w:color w:val="667085"/>
+          <w:sz w:val="18"/>
+        </w:rPr>
+        <w:t xml:space="preserve">Alternative Credit Scoring and Financial Inclusion</w:t>
+      </w:r>
+    </w:p>
+    <w:p>
+      <w:pPr>
+        <w:pStyle w:val="BodyText"/>
+        <w:spacing w:before="60" w:after="20"/>
         <w:jc w:val="center"/>
       </w:pPr>
       <w:r>
@@ -48,15 +114,31 @@
           <w:b/>
           <w:bCs/>
           <w:color w:val="17365D"/>
-          <w:sz w:val="21"/>
-        </w:rPr>
-        <w:t xml:space="preserve">Nikhil Upadhyay · Sharath B S · Shaikh Asgar</w:t>
+          <w:sz w:val="19"/>
+        </w:rPr>
+        <w:t xml:space="preserve">Team name:</w:t>
+      </w:r>
+      <w:r>
+        <w:rPr>
+          <w:rFonts w:ascii="Aptos" w:hAnsi="Aptos" w:eastAsia="Aptos"/>
+          <w:color w:val="17365D"/>
+          <w:sz w:val="19"/>
+        </w:rPr>
+        <w:t xml:space="preserve"> </w:t>
+      </w:r>
+      <w:r>
+        <w:rPr>
+          <w:rFonts w:ascii="Aptos" w:hAnsi="Aptos" w:eastAsia="Aptos"/>
+          <w:color w:val="17365D"/>
+          <w:sz w:val="19"/>
+        </w:rPr>
+        <w:t xml:space="preserve">Winterfell Club</w:t>
       </w:r>
     </w:p>
     <w:p>
       <w:pPr>
         <w:pStyle w:val="BodyText"/>
-        <w:spacing w:after="20"/>
+        <w:spacing w:before="20" w:after="20"/>
         <w:jc w:val="center"/>
       </w:pPr>
       <w:r>
@@ -65,32 +147,66 @@
           <w:b/>
           <w:bCs/>
           <w:color w:val="17365D"/>
-          <w:sz w:val="20"/>
-        </w:rPr>
-        <w:t xml:space="preserve">Winterfell Club</w:t>
-      </w:r>
-    </w:p>
-    <w:p>
-      <w:pPr>
-        <w:pStyle w:val="BodyText"/>
-        <w:spacing w:after="40"/>
+          <w:sz w:val="19"/>
+        </w:rPr>
+        <w:t xml:space="preserve">Team members:</w:t>
+      </w:r>
+    </w:p>
+    <w:p>
+      <w:pPr>
+        <w:pStyle w:val="Compact"/>
+        <w:spacing w:after="0"/>
+        <w:ind w:left="0" w:firstLine="0"/>
         <w:jc w:val="center"/>
       </w:pPr>
       <w:r>
         <w:rPr>
           <w:rFonts w:ascii="Aptos" w:hAnsi="Aptos" w:eastAsia="Aptos"/>
-          <w:i/>
-          <w:iCs/>
-          <w:color w:val="667085"/>
-          <w:sz w:val="19"/>
-        </w:rPr>
-        <w:t xml:space="preserve">FinTech · Alternative Credit Scoring and Financial Inclusion</w:t>
-      </w:r>
-    </w:p>
-    <w:p>
-      <w:pPr>
-        <w:pStyle w:val="BodyText"/>
-        <w:spacing w:after="160"/>
+          <w:b w:val="0"/>
+          <w:color w:val="17365D"/>
+          <w:sz w:val="18"/>
+        </w:rPr>
+        <w:t xml:space="preserve">Nikhil Upadhyay</w:t>
+      </w:r>
+    </w:p>
+    <w:p>
+      <w:pPr>
+        <w:pStyle w:val="Compact"/>
+        <w:spacing w:after="0"/>
+        <w:ind w:left="0" w:firstLine="0"/>
+        <w:jc w:val="center"/>
+      </w:pPr>
+      <w:r>
+        <w:rPr>
+          <w:rFonts w:ascii="Aptos" w:hAnsi="Aptos" w:eastAsia="Aptos"/>
+          <w:b w:val="0"/>
+          <w:color w:val="17365D"/>
+          <w:sz w:val="18"/>
+        </w:rPr>
+        <w:t xml:space="preserve">Sharath B S</w:t>
+      </w:r>
+    </w:p>
+    <w:p>
+      <w:pPr>
+        <w:pStyle w:val="Compact"/>
+        <w:spacing w:after="0"/>
+        <w:ind w:left="0" w:firstLine="0"/>
+        <w:jc w:val="center"/>
+      </w:pPr>
+      <w:r>
+        <w:rPr>
+          <w:rFonts w:ascii="Aptos" w:hAnsi="Aptos" w:eastAsia="Aptos"/>
+          <w:b w:val="0"/>
+          <w:color w:val="17365D"/>
+          <w:sz w:val="18"/>
+        </w:rPr>
+        <w:t xml:space="preserve">Shaikh Asgar</w:t>
+      </w:r>
+    </w:p>
+    <w:p>
+      <w:pPr>
+        <w:pStyle w:val="FirstParagraph"/>
+        <w:spacing w:before="60" w:after="80"/>
         <w:jc w:val="center"/>
       </w:pPr>
       <w:r>
@@ -101,7 +217,7 @@
           <w:color w:val="667085"/>
           <w:sz w:val="17"/>
         </w:rPr>
-        <w:t xml:space="preserve">Repository:</w:t>
+        <w:t xml:space="preserve">GitHub repository:</w:t>
       </w:r>
       <w:r>
         <w:rPr>
@@ -120,46 +236,46 @@
         </w:r>
       </w:hyperlink>
     </w:p>
-    <w:bookmarkEnd w:id="21"/>
-    <w:bookmarkStart w:id="22" w:name="abstract"/>
-    <w:p>
-      <w:pPr>
-        <w:pStyle w:val="Heading2"/>
-        <w:spacing w:before="100" w:after="60"/>
-        <w:jc w:val="center"/>
+    <w:p>
+      <w:pPr>
+        <w:pStyle w:val="BodyText"/>
+        <w:spacing w:before="80" w:after="80"/>
+        <w:ind w:left="504" w:right="504"/>
+        <w:jc w:val="both"/>
       </w:pPr>
       <w:r>
         <w:rPr>
           <w:rFonts w:ascii="Aptos" w:hAnsi="Aptos" w:eastAsia="Aptos"/>
           <w:b/>
-          <w:color w:val="17365D"/>
-          <w:sz w:val="21"/>
-        </w:rPr>
-        <w:t xml:space="preserve">Abstract</w:t>
-      </w:r>
-    </w:p>
-    <w:p>
-      <w:pPr>
-        <w:pStyle w:val="FirstParagraph"/>
-        <w:spacing w:after="60" w:line="252" w:lineRule="auto"/>
-        <w:ind w:left="432" w:right="432"/>
-        <w:jc w:val="both"/>
-      </w:pPr>
+          <w:bCs/>
+          <w:color w:val="667085"/>
+          <w:sz w:val="18"/>
+        </w:rPr>
+        <w:t xml:space="preserve">Prototype scope:</w:t>
+      </w:r>
       <w:r>
         <w:rPr>
           <w:rFonts w:ascii="Aptos" w:hAnsi="Aptos" w:eastAsia="Aptos"/>
-          <w:color w:val="202939"/>
+          <w:color w:val="667085"/>
           <w:sz w:val="18"/>
         </w:rPr>
-        <w:t xml:space="preserve">Gig workers often generate consistent income without the salary documentation or established credit history expected by conventional underwriting. EarnScore addresses this mismatch through an explainable decision-support prototype that converts fragmented simulated transaction records into a consolidated profile of earning consistency, stability, cash-flow health, source diversity, income trend, and financial buffer. The implemented system combines a tested CSV normalization pipeline, seven financial features, separate evidence-quality indicators, a deterministic 300–900 scoring API, and a lender-facing React dashboard. Three integrated personas produced materially different assessments: a stable worker scored 836 (Strong), while volatile and seasonal workers scored 485 and 509 (Needs Review). The design deliberately separates data-quality confidence from financial assessment, ensuring that extensive evidence can still reveal an unstable earning pattern. EarnScore is not a trained machine-learning credit-risk model, an officially validated credit score, or an automated loan-approval system. It demonstrates how transparent cash-flow evidence and human review can support fairer assessment of non-salaried workers while preserving uncertainty, explainability, and responsible-use constraints.</w:t>
-      </w:r>
-    </w:p>
-    <w:p>
-      <w:pPr>
-        <w:pStyle w:val="BodyText"/>
-        <w:spacing w:after="140"/>
-        <w:ind w:left="432" w:right="432"/>
-        <w:jc w:val="both"/>
+        <w:t xml:space="preserve"> </w:t>
+      </w:r>
+      <w:r>
+        <w:rPr>
+          <w:rFonts w:ascii="Aptos" w:hAnsi="Aptos" w:eastAsia="Aptos"/>
+          <w:color w:val="667085"/>
+          <w:sz w:val="18"/>
+        </w:rPr>
+        <w:t xml:space="preserve">EarnScore is an explainable decision-support prototype. It is not an officially validated credit score, a trained machine-learning credit-risk model, or an automated loan-approval system.</w:t>
+      </w:r>
+    </w:p>
+    <w:p>
+      <w:pPr>
+        <w:pStyle w:val="BlockText"/>
+        <w:spacing w:before="80" w:after="100"/>
+        <w:ind w:left="576" w:right="576"/>
+        <w:jc w:val="center"/>
       </w:pPr>
       <w:r>
         <w:rPr>
@@ -169,7 +285,7 @@
           <w:color w:val="17365D"/>
           <w:sz w:val="18"/>
         </w:rPr>
-        <w:t xml:space="preserve">Keywords—</w:t>
+        <w:t xml:space="preserve">One-line pitch:</w:t>
       </w:r>
       <w:r>
         <w:rPr>
@@ -185,28 +301,18 @@
           <w:color w:val="17365D"/>
           <w:sz w:val="18"/>
         </w:rPr>
-        <w:t xml:space="preserve">alternative credit scoring; gig workers; financial inclusion; cash-flow underwriting; explainable FinTech; income stability; decision support.</w:t>
-      </w:r>
-    </w:p>
-    <w:p>
-      <w:pPr>
-        <w:spacing w:after="60" w:line="252" w:lineRule="auto"/>
-        <w:ind w:left="432" w:right="432"/>
-        <w:jc w:val="both"/>
-      </w:pPr>
-      <w:r>
-        <w:rPr>
-          <w:rFonts w:ascii="Aptos" w:hAnsi="Aptos" w:eastAsia="Aptos"/>
-          <w:color w:val="202939"/>
-          <w:sz w:val="18"/>
-        </w:rPr>
+        <w:t xml:space="preserve">EarnScore converts fragmented gig-worker income and cash-flow records into an explainable financial profile that helps lenders recognize consistent earning capacity beyond salary slips and conventional credit history.</w:t>
+      </w:r>
+    </w:p>
+    <w:p>
+      <w:r>
         <w:pict>
           <v:rect style="width:0;height:1.5pt" o:hralign="center" o:hrstd="t" o:hr="t"/>
         </w:pict>
       </w:r>
     </w:p>
-    <w:bookmarkEnd w:id="22"/>
-    <w:bookmarkStart w:id="23" w:name="X545b543f25018b258c1cb4867f1df525baa4e93"/>
+    <w:bookmarkEnd w:id="21"/>
+    <w:bookmarkStart w:id="22" w:name="X545b543f25018b258c1cb4867f1df525baa4e93"/>
     <w:p>
       <w:pPr>
         <w:pStyle w:val="Heading2"/>
@@ -247,8 +353,8 @@
         <w:t xml:space="preserve">The challenge is to build a practical software layer that consolidates dispersed financial signals and presents them as a transparent, interpretable assessment of income consistency, cash-flow resilience, and repayment capacity. The output should support a lender's judgment without becoming an opaque or fully automated lending decision.</w:t>
       </w:r>
     </w:p>
-    <w:bookmarkEnd w:id="23"/>
-    <w:bookmarkStart w:id="30" w:name="Xe3f610cbb977f0e299cbc30d3bd91ac76f8acf2"/>
+    <w:bookmarkEnd w:id="22"/>
+    <w:bookmarkStart w:id="29" w:name="Xe3f610cbb977f0e299cbc30d3bd91ac76f8acf2"/>
     <w:p>
       <w:pPr>
         <w:pStyle w:val="Heading2"/>
@@ -259,7 +365,7 @@
         <w:t xml:space="preserve">2. Problem Statement Understanding</w:t>
       </w:r>
     </w:p>
-    <w:bookmarkStart w:id="24" w:name="Xd7277501f7d6887c80a934af9f29f9a1bfbc453"/>
+    <w:bookmarkStart w:id="23" w:name="Xd7277501f7d6887c80a934af9f29f9a1bfbc453"/>
     <w:p>
       <w:pPr>
         <w:pStyle w:val="Heading3"/>
@@ -280,8 +386,8 @@
         <w:t xml:space="preserve">A salaried employee usually presents one employer, one salary amount, and a predictable payment date. A gig worker may complete work every week but receive different amounts from multiple sources on different days. A simple salary check therefore mistakes a different earning pattern for an absence of stability.</w:t>
       </w:r>
     </w:p>
-    <w:bookmarkEnd w:id="24"/>
-    <w:bookmarkStart w:id="25" w:name="X3d2603b9c3f0b71f8707864becda50f97d6b106"/>
+    <w:bookmarkEnd w:id="23"/>
+    <w:bookmarkStart w:id="24" w:name="X3d2603b9c3f0b71f8707864becda50f97d6b106"/>
     <w:p>
       <w:pPr>
         <w:pStyle w:val="Heading3"/>
@@ -302,8 +408,8 @@
         <w:t xml:space="preserve">A credit bureau is useful when a person has already used formal credit. It provides less information for a new-to-credit worker. Rejecting such an applicant solely because no past loan exists creates a circular problem: a person needs credit history to access the first suitable credit product.</w:t>
       </w:r>
     </w:p>
-    <w:bookmarkEnd w:id="25"/>
-    <w:bookmarkStart w:id="26" w:name="Xbbc7ba146d1e6931cdb870a6c24c63e087137c7"/>
+    <w:bookmarkEnd w:id="24"/>
+    <w:bookmarkStart w:id="25" w:name="Xbbc7ba146d1e6931cdb870a6c24c63e087137c7"/>
     <w:p>
       <w:pPr>
         <w:pStyle w:val="Heading3"/>
@@ -324,8 +430,8 @@
         <w:t xml:space="preserve">Two applicants may earn the same annual amount while having very different financial conditions. One may earn consistently from several sources and maintain positive cash flow. The other may receive a few large, unpredictable payments and experience long income gaps. A useful assessment must evaluate the pattern, stability, diversity, and sustainability of income rather than only its total.</w:t>
       </w:r>
     </w:p>
-    <w:bookmarkEnd w:id="26"/>
-    <w:bookmarkStart w:id="27" w:name="data-quality-must-affect-certainty"/>
+    <w:bookmarkEnd w:id="25"/>
+    <w:bookmarkStart w:id="26" w:name="data-quality-must-affect-certainty"/>
     <w:p>
       <w:pPr>
         <w:pStyle w:val="Heading3"/>
@@ -359,8 +465,8 @@
         <w:t xml:space="preserve">. Missing months, short observation periods, unclassified transactions, and unverifiable sources lower confidence and trigger a request for more evidence.</w:t>
       </w:r>
     </w:p>
-    <w:bookmarkEnd w:id="27"/>
-    <w:bookmarkStart w:id="28" w:name="Xdad76a552a3ecf8a68fbdef66a439943e92ad39"/>
+    <w:bookmarkEnd w:id="26"/>
+    <w:bookmarkStart w:id="27" w:name="Xdad76a552a3ecf8a68fbdef66a439943e92ad39"/>
     <w:p>
       <w:pPr>
         <w:pStyle w:val="Heading3"/>
@@ -381,8 +487,8 @@
         <w:t xml:space="preserve">Alternative data can expand access, but poorly chosen signals can reproduce bias. EarnScore excludes protected traits such as religion, caste, gender, and ethnicity. It also avoids using platform identity, device type, or location as unexplained proxies. Every score contribution must link to a visible financial feature and supporting evidence. The lender remains responsible for the final decision.</w:t>
       </w:r>
     </w:p>
-    <w:bookmarkEnd w:id="28"/>
-    <w:bookmarkStart w:id="29" w:name="primary-users-and-their-needs"/>
+    <w:bookmarkEnd w:id="27"/>
+    <w:bookmarkStart w:id="28" w:name="primary-users-and-their-needs"/>
     <w:p>
       <w:pPr>
         <w:pStyle w:val="Heading3"/>
@@ -842,9 +948,9 @@
         </w:tc>
       </w:tr>
     </w:tbl>
+    <w:bookmarkEnd w:id="28"/>
     <w:bookmarkEnd w:id="29"/>
-    <w:bookmarkEnd w:id="30"/>
-    <w:bookmarkStart w:id="42" w:name="X5ed607bb45a37c165afc3e191f64390c6852d57"/>
+    <w:bookmarkStart w:id="41" w:name="X5ed607bb45a37c165afc3e191f64390c6852d57"/>
     <w:p>
       <w:pPr>
         <w:pStyle w:val="Heading2"/>
@@ -865,7 +971,7 @@
         <w:t xml:space="preserve">EarnScore is an explainable decision-support platform that transforms raw gig-platform and bank transaction records into a lender-ready financial profile.</w:t>
       </w:r>
     </w:p>
-    <w:bookmarkStart w:id="31" w:name="user-journey"/>
+    <w:bookmarkStart w:id="30" w:name="user-journey"/>
     <w:p>
       <w:pPr>
         <w:pStyle w:val="Heading3"/>
@@ -882,7 +988,7 @@
         <w:widowControl/>
         <w:numPr>
           <w:ilvl w:val="0"/>
-          <w:numId w:val="1001"/>
+          <w:numId w:val="1002"/>
         </w:numPr>
       </w:pPr>
       <w:r>
@@ -905,7 +1011,7 @@
         <w:widowControl/>
         <w:numPr>
           <w:ilvl w:val="0"/>
-          <w:numId w:val="1001"/>
+          <w:numId w:val="1002"/>
         </w:numPr>
       </w:pPr>
       <w:r>
@@ -928,7 +1034,7 @@
         <w:widowControl/>
         <w:numPr>
           <w:ilvl w:val="0"/>
-          <w:numId w:val="1001"/>
+          <w:numId w:val="1002"/>
         </w:numPr>
       </w:pPr>
       <w:r>
@@ -951,7 +1057,7 @@
         <w:widowControl/>
         <w:numPr>
           <w:ilvl w:val="0"/>
-          <w:numId w:val="1001"/>
+          <w:numId w:val="1002"/>
         </w:numPr>
       </w:pPr>
       <w:r>
@@ -974,7 +1080,7 @@
         <w:widowControl/>
         <w:numPr>
           <w:ilvl w:val="0"/>
-          <w:numId w:val="1001"/>
+          <w:numId w:val="1002"/>
         </w:numPr>
       </w:pPr>
       <w:r>
@@ -997,7 +1103,7 @@
         <w:widowControl/>
         <w:numPr>
           <w:ilvl w:val="0"/>
-          <w:numId w:val="1001"/>
+          <w:numId w:val="1002"/>
         </w:numPr>
       </w:pPr>
       <w:r>
@@ -1020,7 +1126,7 @@
         <w:widowControl/>
         <w:numPr>
           <w:ilvl w:val="0"/>
-          <w:numId w:val="1001"/>
+          <w:numId w:val="1002"/>
         </w:numPr>
       </w:pPr>
       <w:r>
@@ -1043,7 +1149,7 @@
         <w:widowControl/>
         <w:numPr>
           <w:ilvl w:val="0"/>
-          <w:numId w:val="1001"/>
+          <w:numId w:val="1002"/>
         </w:numPr>
       </w:pPr>
       <w:r>
@@ -1060,8 +1166,8 @@
         <w:t xml:space="preserve">A lender may approve, decline, or request more information and record notes. The review decision does not silently alter the calculated score.</w:t>
       </w:r>
     </w:p>
-    <w:bookmarkEnd w:id="31"/>
-    <w:bookmarkStart w:id="32" w:name="explainable-score-design"/>
+    <w:bookmarkEnd w:id="30"/>
+    <w:bookmarkStart w:id="31" w:name="explainable-score-design"/>
     <w:p>
       <w:pPr>
         <w:pStyle w:val="Heading3"/>
@@ -2023,7 +2129,7 @@
         <w:widowControl/>
         <w:numPr>
           <w:ilvl w:val="0"/>
-          <w:numId w:val="1002"/>
+          <w:numId w:val="1003"/>
         </w:numPr>
       </w:pPr>
       <w:r>
@@ -2046,7 +2152,7 @@
         <w:widowControl/>
         <w:numPr>
           <w:ilvl w:val="0"/>
-          <w:numId w:val="1002"/>
+          <w:numId w:val="1003"/>
         </w:numPr>
       </w:pPr>
       <w:r>
@@ -2069,7 +2175,7 @@
         <w:widowControl/>
         <w:numPr>
           <w:ilvl w:val="0"/>
-          <w:numId w:val="1002"/>
+          <w:numId w:val="1003"/>
         </w:numPr>
       </w:pPr>
       <w:r>
@@ -2096,8 +2202,8 @@
         <w:t xml:space="preserve">These bands describe observed financial behavior. They do not claim a validated probability of default. Production use would require lender-specific outcome data, calibration, bias testing, regulatory review, and continuous monitoring.</w:t>
       </w:r>
     </w:p>
-    <w:bookmarkEnd w:id="32"/>
-    <w:bookmarkStart w:id="33" w:name="mvp-architecture"/>
+    <w:bookmarkEnd w:id="31"/>
+    <w:bookmarkStart w:id="32" w:name="mvp-architecture"/>
     <w:p>
       <w:pPr>
         <w:pStyle w:val="Heading3"/>
@@ -2241,8 +2347,8 @@
         <w:t xml:space="preserve">The hackathon implementation uses React, Vite, JavaScript, and responsive CSS for the dashboard, with Python, FastAPI, Pydantic, pandas, and NumPy for the data and scoring services. Reproducible CSV fixtures provide demonstration data without requiring access to real financial information.</w:t>
       </w:r>
     </w:p>
-    <w:bookmarkEnd w:id="33"/>
-    <w:bookmarkStart w:id="38" w:name="implemented-mvp"/>
+    <w:bookmarkEnd w:id="32"/>
+    <w:bookmarkStart w:id="37" w:name="implemented-mvp"/>
     <w:p>
       <w:pPr>
         <w:pStyle w:val="Heading3"/>
@@ -2261,208 +2367,6 @@
       </w:pPr>
       <w:r>
         <w:t xml:space="preserve">The three development branches already contain the following working components:</w:t>
-      </w:r>
-    </w:p>
-    <w:p>
-      <w:pPr>
-        <w:pStyle w:val="Compact"/>
-        <w:widowControl/>
-        <w:numPr>
-          <w:ilvl w:val="0"/>
-          <w:numId w:val="1003"/>
-        </w:numPr>
-      </w:pPr>
-      <w:r>
-        <w:rPr>
-          <w:b/>
-          <w:bCs/>
-        </w:rPr>
-        <w:t xml:space="preserve">Data pipeline:</w:t>
-      </w:r>
-      <w:r>
-        <w:t xml:space="preserve"> </w:t>
-      </w:r>
-      <w:r>
-        <w:t xml:space="preserve">Three reproducible personas—stable, volatile, and seasonal—plus schema validation, transaction classification, exact-duplicate removal, conflicting-record quarantine, refund and transfer handling, monthly aggregation, seven financial features, and a command-line CSV-to-JSON workflow.</w:t>
-      </w:r>
-    </w:p>
-    <w:p>
-      <w:pPr>
-        <w:pStyle w:val="Compact"/>
-        <w:widowControl/>
-        <w:numPr>
-          <w:ilvl w:val="0"/>
-          <w:numId w:val="1003"/>
-        </w:numPr>
-      </w:pPr>
-      <w:r>
-        <w:rPr>
-          <w:b/>
-          <w:bCs/>
-        </w:rPr>
-        <w:t xml:space="preserve">Data-quality engine:</w:t>
-      </w:r>
-      <w:r>
-        <w:t xml:space="preserve"> </w:t>
-      </w:r>
-      <w:r>
-        <w:t xml:space="preserve">Measures observed and missing months, transaction count, unclassified ratio, and evidence confidence. Its deterministic confidence formula considers coverage, transaction density, classification quality, and active earning history.</w:t>
-      </w:r>
-    </w:p>
-    <w:p>
-      <w:pPr>
-        <w:pStyle w:val="Compact"/>
-        <w:widowControl/>
-        <w:numPr>
-          <w:ilvl w:val="0"/>
-          <w:numId w:val="1003"/>
-        </w:numPr>
-      </w:pPr>
-      <w:r>
-        <w:rPr>
-          <w:b/>
-          <w:bCs/>
-        </w:rPr>
-        <w:t xml:space="preserve">Scoring API:</w:t>
-      </w:r>
-      <w:r>
-        <w:t xml:space="preserve"> </w:t>
-      </w:r>
-      <w:r>
-        <w:t xml:space="preserve">A FastAPI service with health and scoring endpoints, strict request validation, deterministic 300–900 scoring, factor-level points, readable explanations, evidence values, score bands, and risk flags for volatility, high expenses, irregular activity, and unavailable buffer data.</w:t>
-      </w:r>
-    </w:p>
-    <w:p>
-      <w:pPr>
-        <w:pStyle w:val="Compact"/>
-        <w:widowControl/>
-        <w:numPr>
-          <w:ilvl w:val="0"/>
-          <w:numId w:val="1003"/>
-        </w:numPr>
-      </w:pPr>
-      <w:r>
-        <w:rPr>
-          <w:b/>
-          <w:bCs/>
-        </w:rPr>
-        <w:t xml:space="preserve">Lender dashboard:</w:t>
-      </w:r>
-      <w:r>
-        <w:t xml:space="preserve"> </w:t>
-      </w:r>
-      <w:r>
-        <w:t xml:space="preserve">A responsive React interface connected to the scoring API, including an assessment form, score gauge, factor bars, data-quality indicators, risk flags, filtering controls, API status handling, and a human-review panel.</w:t>
-      </w:r>
-    </w:p>
-    <w:p>
-      <w:pPr>
-        <w:pStyle w:val="Compact"/>
-        <w:widowControl/>
-        <w:numPr>
-          <w:ilvl w:val="0"/>
-          <w:numId w:val="1003"/>
-        </w:numPr>
-      </w:pPr>
-      <w:r>
-        <w:rPr>
-          <w:b/>
-          <w:bCs/>
-        </w:rPr>
-        <w:t xml:space="preserve">Automated validation:</w:t>
-      </w:r>
-      <w:r>
-        <w:t xml:space="preserve"> </w:t>
-      </w:r>
-      <w:r>
-        <w:t xml:space="preserve">Unit and integration tests cover generation, schemas, cleaning, feature extraction, command-line execution, scoring boundaries, missing features, API validation, and all three personas.</w:t>
-      </w:r>
-    </w:p>
-    <w:p>
-      <w:pPr>
-        <w:pStyle w:val="FirstParagraph"/>
-        <w:widowControl/>
-        <w:jc w:val="both"/>
-      </w:pPr>
-      <w:r>
-        <w:t xml:space="preserve">The human-review panel records the review locally in the current MVP. Persistent review storage and production identity controls are planned after the hackathon demonstration.</w:t>
-      </w:r>
-    </w:p>
-    <w:bookmarkStart w:id="34" w:name="member-1--data-pipeline"/>
-    <w:p>
-      <w:pPr>
-        <w:pStyle w:val="Heading4"/>
-        <w:keepNext/>
-        <w:keepLines/>
-      </w:pPr>
-      <w:r>
-        <w:t xml:space="preserve">Member 1 — Data pipeline</w:t>
-      </w:r>
-    </w:p>
-    <w:p>
-      <w:pPr>
-        <w:pStyle w:val="FirstParagraph"/>
-        <w:widowControl/>
-        <w:jc w:val="both"/>
-      </w:pPr>
-      <w:r>
-        <w:t xml:space="preserve">The</w:t>
-      </w:r>
-      <w:r>
-        <w:t xml:space="preserve"> </w:t>
-      </w:r>
-      <w:r>
-        <w:rPr>
-          <w:rStyle w:val="VerbatimChar"/>
-        </w:rPr>
-        <w:t xml:space="preserve">feature/data-pipeline</w:t>
-      </w:r>
-      <w:r>
-        <w:t xml:space="preserve"> </w:t>
-      </w:r>
-      <w:r>
-        <w:t xml:space="preserve">branch at verified development commit</w:t>
-      </w:r>
-      <w:r>
-        <w:t xml:space="preserve"> </w:t>
-      </w:r>
-      <w:r>
-        <w:rPr>
-          <w:rStyle w:val="VerbatimChar"/>
-        </w:rPr>
-        <w:t xml:space="preserve">9482669</w:t>
-      </w:r>
-      <w:r>
-        <w:t xml:space="preserve"> </w:t>
-      </w:r>
-      <w:r>
-        <w:t xml:space="preserve">contains three simulated gig-worker datasets with</w:t>
-      </w:r>
-      <w:r>
-        <w:t xml:space="preserve"> </w:t>
-      </w:r>
-      <w:r>
-        <w:rPr>
-          <w:b/>
-          <w:bCs/>
-        </w:rPr>
-        <w:t xml:space="preserve">593 transactions</w:t>
-      </w:r>
-      <w:r>
-        <w:t xml:space="preserve"> </w:t>
-      </w:r>
-      <w:r>
-        <w:t xml:space="preserve">in total: 360 for the stable persona, 71 for the volatile persona, and 162 for the seasonal persona. The pipeline performs CSV ingestion, schema validation, normalization, exact-duplicate removal, conflicting-duplicate quarantine, refund and transfer handling, transaction classification, monthly aggregation, and CSV-to-JSON output.</w:t>
-      </w:r>
-    </w:p>
-    <w:p>
-      <w:pPr>
-        <w:pStyle w:val="BodyText"/>
-        <w:widowControl/>
-        <w:jc w:val="both"/>
-      </w:pPr>
-      <w:r>
-        <w:t xml:space="preserve">It calculates seven financial features:</w:t>
       </w:r>
     </w:p>
     <w:p>
@@ -2476,9 +2380,16 @@
       </w:pPr>
       <w:r>
         <w:rPr>
-          <w:rStyle w:val="VerbatimChar"/>
-        </w:rPr>
-        <w:t xml:space="preserve">active_months_ratio</w:t>
+          <w:b/>
+          <w:bCs/>
+        </w:rPr>
+        <w:t xml:space="preserve">Data pipeline:</w:t>
+      </w:r>
+      <w:r>
+        <w:t xml:space="preserve"> </w:t>
+      </w:r>
+      <w:r>
+        <w:t xml:space="preserve">Three reproducible personas—stable, volatile, and seasonal—plus schema validation, transaction classification, exact-duplicate removal, conflicting-record quarantine, refund and transfer handling, monthly aggregation, seven financial features, and a command-line CSV-to-JSON workflow.</w:t>
       </w:r>
     </w:p>
     <w:p>
@@ -2492,9 +2403,16 @@
       </w:pPr>
       <w:r>
         <w:rPr>
-          <w:rStyle w:val="VerbatimChar"/>
-        </w:rPr>
-        <w:t xml:space="preserve">income_cv</w:t>
+          <w:b/>
+          <w:bCs/>
+        </w:rPr>
+        <w:t xml:space="preserve">Data-quality engine:</w:t>
+      </w:r>
+      <w:r>
+        <w:t xml:space="preserve"> </w:t>
+      </w:r>
+      <w:r>
+        <w:t xml:space="preserve">Measures observed and missing months, transaction count, unclassified ratio, and evidence confidence. Its deterministic confidence formula considers coverage, transaction density, classification quality, and active earning history.</w:t>
       </w:r>
     </w:p>
     <w:p>
@@ -2508,9 +2426,16 @@
       </w:pPr>
       <w:r>
         <w:rPr>
-          <w:rStyle w:val="VerbatimChar"/>
-        </w:rPr>
-        <w:t xml:space="preserve">source_diversity</w:t>
+          <w:b/>
+          <w:bCs/>
+        </w:rPr>
+        <w:t xml:space="preserve">Scoring API:</w:t>
+      </w:r>
+      <w:r>
+        <w:t xml:space="preserve"> </w:t>
+      </w:r>
+      <w:r>
+        <w:t xml:space="preserve">A FastAPI service with health and scoring endpoints, strict request validation, deterministic 300–900 scoring, factor-level points, readable explanations, evidence values, score bands, and risk flags for volatility, high expenses, irregular activity, and unavailable buffer data.</w:t>
       </w:r>
     </w:p>
     <w:p>
@@ -2524,9 +2449,16 @@
       </w:pPr>
       <w:r>
         <w:rPr>
-          <w:rStyle w:val="VerbatimChar"/>
-        </w:rPr>
-        <w:t xml:space="preserve">positive_cashflow_months_ratio</w:t>
+          <w:b/>
+          <w:bCs/>
+        </w:rPr>
+        <w:t xml:space="preserve">Lender dashboard:</w:t>
+      </w:r>
+      <w:r>
+        <w:t xml:space="preserve"> </w:t>
+      </w:r>
+      <w:r>
+        <w:t xml:space="preserve">A responsive React interface connected to the scoring API, including an assessment form, score gauge, factor bars, data-quality indicators, risk flags, filtering controls, API status handling, and a human-review panel.</w:t>
       </w:r>
     </w:p>
     <w:p>
@@ -2540,101 +2472,29 @@
       </w:pPr>
       <w:r>
         <w:rPr>
-          <w:rStyle w:val="VerbatimChar"/>
-        </w:rPr>
-        <w:t xml:space="preserve">expense_to_income_ratio</w:t>
-      </w:r>
-    </w:p>
-    <w:p>
-      <w:pPr>
-        <w:pStyle w:val="Compact"/>
-        <w:widowControl/>
-        <w:numPr>
-          <w:ilvl w:val="0"/>
-          <w:numId w:val="1004"/>
-        </w:numPr>
-      </w:pPr>
-      <w:r>
-        <w:rPr>
-          <w:rStyle w:val="VerbatimChar"/>
-        </w:rPr>
-        <w:t xml:space="preserve">income_trend</w:t>
-      </w:r>
-    </w:p>
-    <w:p>
-      <w:pPr>
-        <w:pStyle w:val="Compact"/>
-        <w:widowControl/>
-        <w:numPr>
-          <w:ilvl w:val="0"/>
-          <w:numId w:val="1004"/>
-        </w:numPr>
-      </w:pPr>
-      <w:r>
-        <w:rPr>
-          <w:rStyle w:val="VerbatimChar"/>
-        </w:rPr>
-        <w:t xml:space="preserve">emergency_buffer_days</w:t>
-      </w:r>
-    </w:p>
-    <w:p>
-      <w:pPr>
-        <w:pStyle w:val="FirstParagraph"/>
-        <w:widowControl/>
-        <w:jc w:val="both"/>
-      </w:pPr>
-      <w:r>
-        <w:t xml:space="preserve">Source diversity uses a normalized income-concentration measure. Emergency-buffer information is returned as</w:t>
-      </w:r>
-      <w:r>
-        <w:t xml:space="preserve"> </w:t>
-      </w:r>
-      <w:r>
-        <w:rPr>
-          <w:rStyle w:val="VerbatimChar"/>
-        </w:rPr>
-        <w:t xml:space="preserve">null</w:t>
-      </w:r>
-      <w:r>
-        <w:t xml:space="preserve"> </w:t>
-      </w:r>
-      <w:r>
-        <w:t xml:space="preserve">when reliable running-balance data is unavailable; it is never silently treated as zero. A separate root-level</w:t>
-      </w:r>
-      <w:r>
-        <w:t xml:space="preserve"> </w:t>
-      </w:r>
-      <w:r>
-        <w:rPr>
-          <w:rStyle w:val="VerbatimChar"/>
-        </w:rPr>
-        <w:t xml:space="preserve">data_quality</w:t>
-      </w:r>
-      <w:r>
-        <w:t xml:space="preserve"> </w:t>
-      </w:r>
-      <w:r>
-        <w:t xml:space="preserve">object reports coverage months, missing months, transaction count, unclassified ratio, and evidence confidence. Member 1 reported</w:t>
-      </w:r>
-      <w:r>
-        <w:t xml:space="preserve"> </w:t>
-      </w:r>
-      <w:r>
-        <w:rPr>
           <w:b/>
           <w:bCs/>
         </w:rPr>
-        <w:t xml:space="preserve">29 automated tests passed</w:t>
-      </w:r>
-      <w:r>
-        <w:t xml:space="preserve"> </w:t>
-      </w:r>
-      <w:r>
-        <w:t xml:space="preserve">for generation, schemas, cleaning, feature extraction, and command-line execution.</w:t>
-      </w:r>
-    </w:p>
-    <w:bookmarkEnd w:id="34"/>
-    <w:bookmarkStart w:id="35" w:name="Xadb32896c5916fd2404a6077908c575faf3e24e"/>
+        <w:t xml:space="preserve">Automated validation:</w:t>
+      </w:r>
+      <w:r>
+        <w:t xml:space="preserve"> </w:t>
+      </w:r>
+      <w:r>
+        <w:t xml:space="preserve">Unit and integration tests cover generation, schemas, cleaning, feature extraction, command-line execution, scoring boundaries, missing features, API validation, and all three personas.</w:t>
+      </w:r>
+    </w:p>
+    <w:p>
+      <w:pPr>
+        <w:pStyle w:val="FirstParagraph"/>
+        <w:widowControl/>
+        <w:jc w:val="both"/>
+      </w:pPr>
+      <w:r>
+        <w:t xml:space="preserve">The human-review panel records the review locally in the current MVP. Persistent review storage and production identity controls are planned after the hackathon demonstration.</w:t>
+      </w:r>
+    </w:p>
+    <w:bookmarkStart w:id="33" w:name="member-1--data-pipeline"/>
     <w:p>
       <w:pPr>
         <w:pStyle w:val="Heading4"/>
@@ -2642,7 +2502,7 @@
         <w:keepLines/>
       </w:pPr>
       <w:r>
-        <w:t xml:space="preserve">Member 2 — backend and explainable scoring API</w:t>
+        <w:t xml:space="preserve">Member 1 — Data pipeline</w:t>
       </w:r>
     </w:p>
     <w:p>
@@ -2661,13 +2521,13 @@
         <w:rPr>
           <w:rStyle w:val="VerbatimChar"/>
         </w:rPr>
-        <w:t xml:space="preserve">feature/scoring-api</w:t>
-      </w:r>
-      <w:r>
-        <w:t xml:space="preserve"> </w:t>
-      </w:r>
-      <w:r>
-        <w:t xml:space="preserve">branch contains the implementation commits</w:t>
+        <w:t xml:space="preserve">feature/data-pipeline</w:t>
+      </w:r>
+      <w:r>
+        <w:t xml:space="preserve"> </w:t>
+      </w:r>
+      <w:r>
+        <w:t xml:space="preserve">branch at verified development commit</w:t>
       </w:r>
       <w:r>
         <w:t xml:space="preserve"> </w:t>
@@ -2676,108 +2536,211 @@
         <w:rPr>
           <w:rStyle w:val="VerbatimChar"/>
         </w:rPr>
-        <w:t xml:space="preserve">62bef8f</w:t>
-      </w:r>
-      <w:r>
-        <w:t xml:space="preserve">,</w:t>
-      </w:r>
-      <w:r>
-        <w:t xml:space="preserve"> </w:t>
-      </w:r>
+        <w:t xml:space="preserve">9482669</w:t>
+      </w:r>
+      <w:r>
+        <w:t xml:space="preserve"> </w:t>
+      </w:r>
+      <w:r>
+        <w:t xml:space="preserve">contains three simulated gig-worker datasets with</w:t>
+      </w:r>
+      <w:r>
+        <w:t xml:space="preserve"> </w:t>
+      </w:r>
+      <w:r>
+        <w:rPr>
+          <w:b/>
+          <w:bCs/>
+        </w:rPr>
+        <w:t xml:space="preserve">593 transactions</w:t>
+      </w:r>
+      <w:r>
+        <w:t xml:space="preserve"> </w:t>
+      </w:r>
+      <w:r>
+        <w:t xml:space="preserve">in total: 360 for the stable persona, 71 for the volatile persona, and 162 for the seasonal persona. The pipeline performs CSV ingestion, schema validation, normalization, exact-duplicate removal, conflicting-duplicate quarantine, refund and transfer handling, transaction classification, monthly aggregation, and CSV-to-JSON output.</w:t>
+      </w:r>
+    </w:p>
+    <w:p>
+      <w:pPr>
+        <w:pStyle w:val="BodyText"/>
+        <w:widowControl/>
+        <w:jc w:val="both"/>
+      </w:pPr>
+      <w:r>
+        <w:t xml:space="preserve">It calculates seven financial features:</w:t>
+      </w:r>
+    </w:p>
+    <w:p>
+      <w:pPr>
+        <w:pStyle w:val="Compact"/>
+        <w:widowControl/>
+        <w:numPr>
+          <w:ilvl w:val="0"/>
+          <w:numId w:val="1005"/>
+        </w:numPr>
+      </w:pPr>
       <w:r>
         <w:rPr>
           <w:rStyle w:val="VerbatimChar"/>
         </w:rPr>
-        <w:t xml:space="preserve">abd5fae</w:t>
-      </w:r>
-      <w:r>
-        <w:t xml:space="preserve">, and</w:t>
-      </w:r>
-      <w:r>
-        <w:t xml:space="preserve"> </w:t>
-      </w:r>
+        <w:t xml:space="preserve">active_months_ratio</w:t>
+      </w:r>
+    </w:p>
+    <w:p>
+      <w:pPr>
+        <w:pStyle w:val="Compact"/>
+        <w:widowControl/>
+        <w:numPr>
+          <w:ilvl w:val="0"/>
+          <w:numId w:val="1005"/>
+        </w:numPr>
+      </w:pPr>
       <w:r>
         <w:rPr>
           <w:rStyle w:val="VerbatimChar"/>
         </w:rPr>
-        <w:t xml:space="preserve">bc47a81</w:t>
-      </w:r>
-      <w:r>
-        <w:t xml:space="preserve">, the three-persona integration-test commit</w:t>
-      </w:r>
-      <w:r>
-        <w:t xml:space="preserve"> </w:t>
-      </w:r>
+        <w:t xml:space="preserve">income_cv</w:t>
+      </w:r>
+    </w:p>
+    <w:p>
+      <w:pPr>
+        <w:pStyle w:val="Compact"/>
+        <w:widowControl/>
+        <w:numPr>
+          <w:ilvl w:val="0"/>
+          <w:numId w:val="1005"/>
+        </w:numPr>
+      </w:pPr>
       <w:r>
         <w:rPr>
           <w:rStyle w:val="VerbatimChar"/>
         </w:rPr>
-        <w:t xml:space="preserve">bce6451</w:t>
-      </w:r>
-      <w:r>
-        <w:t xml:space="preserve">, and CORS integration commit</w:t>
-      </w:r>
-      <w:r>
-        <w:t xml:space="preserve"> </w:t>
-      </w:r>
+        <w:t xml:space="preserve">source_diversity</w:t>
+      </w:r>
+    </w:p>
+    <w:p>
+      <w:pPr>
+        <w:pStyle w:val="Compact"/>
+        <w:widowControl/>
+        <w:numPr>
+          <w:ilvl w:val="0"/>
+          <w:numId w:val="1005"/>
+        </w:numPr>
+      </w:pPr>
       <w:r>
         <w:rPr>
           <w:rStyle w:val="VerbatimChar"/>
         </w:rPr>
-        <w:t xml:space="preserve">0122245</w:t>
-      </w:r>
-      <w:r>
-        <w:t xml:space="preserve">. The Python, FastAPI, Pydantic, and Pytest backend provides</w:t>
-      </w:r>
-      <w:r>
-        <w:t xml:space="preserve"> </w:t>
-      </w:r>
+        <w:t xml:space="preserve">positive_cashflow_months_ratio</w:t>
+      </w:r>
+    </w:p>
+    <w:p>
+      <w:pPr>
+        <w:pStyle w:val="Compact"/>
+        <w:widowControl/>
+        <w:numPr>
+          <w:ilvl w:val="0"/>
+          <w:numId w:val="1005"/>
+        </w:numPr>
+      </w:pPr>
       <w:r>
         <w:rPr>
           <w:rStyle w:val="VerbatimChar"/>
         </w:rPr>
-        <w:t xml:space="preserve">GET /</w:t>
-      </w:r>
-      <w:r>
-        <w:t xml:space="preserve">,</w:t>
-      </w:r>
-      <w:r>
-        <w:t xml:space="preserve"> </w:t>
-      </w:r>
+        <w:t xml:space="preserve">expense_to_income_ratio</w:t>
+      </w:r>
+    </w:p>
+    <w:p>
+      <w:pPr>
+        <w:pStyle w:val="Compact"/>
+        <w:widowControl/>
+        <w:numPr>
+          <w:ilvl w:val="0"/>
+          <w:numId w:val="1005"/>
+        </w:numPr>
+      </w:pPr>
       <w:r>
         <w:rPr>
           <w:rStyle w:val="VerbatimChar"/>
         </w:rPr>
-        <w:t xml:space="preserve">GET /health</w:t>
-      </w:r>
-      <w:r>
-        <w:t xml:space="preserve">, and</w:t>
-      </w:r>
-      <w:r>
-        <w:t xml:space="preserve"> </w:t>
-      </w:r>
+        <w:t xml:space="preserve">income_trend</w:t>
+      </w:r>
+    </w:p>
+    <w:p>
+      <w:pPr>
+        <w:pStyle w:val="Compact"/>
+        <w:widowControl/>
+        <w:numPr>
+          <w:ilvl w:val="0"/>
+          <w:numId w:val="1005"/>
+        </w:numPr>
+      </w:pPr>
       <w:r>
         <w:rPr>
           <w:rStyle w:val="VerbatimChar"/>
         </w:rPr>
-        <w:t xml:space="preserve">POST /score</w:t>
-      </w:r>
-      <w:r>
-        <w:t xml:space="preserve">.</w:t>
-      </w:r>
-    </w:p>
-    <w:p>
-      <w:pPr>
-        <w:pStyle w:val="BodyText"/>
+        <w:t xml:space="preserve">emergency_buffer_days</w:t>
+      </w:r>
+    </w:p>
+    <w:p>
+      <w:pPr>
+        <w:pStyle w:val="FirstParagraph"/>
         <w:widowControl/>
         <w:jc w:val="both"/>
       </w:pPr>
       <w:r>
-        <w:t xml:space="preserve">The API validates request bounds; calculates a deterministic score from 300 to 900; returns assessment bands, factor-level point contributions, explanations, and evidence values; preserves the pipeline's data-quality object; reports feature-completeness confidence separately; and generates risk flags. When a feature is genuinely unavailable, its scoring weight is excluded and the remaining factor weights are normalized. Factor points always reconcile with the final score.</w:t>
-      </w:r>
-    </w:p>
-    <w:bookmarkEnd w:id="35"/>
-    <w:bookmarkStart w:id="36" w:name="member-3--react-lender-dashboard"/>
+        <w:t xml:space="preserve">Source diversity uses a normalized income-concentration measure. Emergency-buffer information is returned as</w:t>
+      </w:r>
+      <w:r>
+        <w:t xml:space="preserve"> </w:t>
+      </w:r>
+      <w:r>
+        <w:rPr>
+          <w:rStyle w:val="VerbatimChar"/>
+        </w:rPr>
+        <w:t xml:space="preserve">null</w:t>
+      </w:r>
+      <w:r>
+        <w:t xml:space="preserve"> </w:t>
+      </w:r>
+      <w:r>
+        <w:t xml:space="preserve">when reliable running-balance data is unavailable; it is never silently treated as zero. A separate root-level</w:t>
+      </w:r>
+      <w:r>
+        <w:t xml:space="preserve"> </w:t>
+      </w:r>
+      <w:r>
+        <w:rPr>
+          <w:rStyle w:val="VerbatimChar"/>
+        </w:rPr>
+        <w:t xml:space="preserve">data_quality</w:t>
+      </w:r>
+      <w:r>
+        <w:t xml:space="preserve"> </w:t>
+      </w:r>
+      <w:r>
+        <w:t xml:space="preserve">object reports coverage months, missing months, transaction count, unclassified ratio, and evidence confidence. Member 1 reported</w:t>
+      </w:r>
+      <w:r>
+        <w:t xml:space="preserve"> </w:t>
+      </w:r>
+      <w:r>
+        <w:rPr>
+          <w:b/>
+          <w:bCs/>
+        </w:rPr>
+        <w:t xml:space="preserve">29 automated tests passed</w:t>
+      </w:r>
+      <w:r>
+        <w:t xml:space="preserve"> </w:t>
+      </w:r>
+      <w:r>
+        <w:t xml:space="preserve">for generation, schemas, cleaning, feature extraction, and command-line execution.</w:t>
+      </w:r>
+    </w:p>
+    <w:bookmarkEnd w:id="33"/>
+    <w:bookmarkStart w:id="34" w:name="Xadb32896c5916fd2404a6077908c575faf3e24e"/>
     <w:p>
       <w:pPr>
         <w:pStyle w:val="Heading4"/>
@@ -2785,7 +2748,7 @@
         <w:keepLines/>
       </w:pPr>
       <w:r>
-        <w:t xml:space="preserve">Member 3 — React lender dashboard</w:t>
+        <w:t xml:space="preserve">Member 2 — backend and explainable scoring API</w:t>
       </w:r>
     </w:p>
     <w:p>
@@ -2804,13 +2767,13 @@
         <w:rPr>
           <w:rStyle w:val="VerbatimChar"/>
         </w:rPr>
-        <w:t xml:space="preserve">feature/lender-dashboard</w:t>
-      </w:r>
-      <w:r>
-        <w:t xml:space="preserve"> </w:t>
-      </w:r>
-      <w:r>
-        <w:t xml:space="preserve">branch at reported commit</w:t>
+        <w:t xml:space="preserve">feature/scoring-api</w:t>
+      </w:r>
+      <w:r>
+        <w:t xml:space="preserve"> </w:t>
+      </w:r>
+      <w:r>
+        <w:t xml:space="preserve">branch contains the implementation commits</w:t>
       </w:r>
       <w:r>
         <w:t xml:space="preserve"> </w:t>
@@ -2819,13 +2782,10 @@
         <w:rPr>
           <w:rStyle w:val="VerbatimChar"/>
         </w:rPr>
-        <w:t xml:space="preserve">2448073</w:t>
-      </w:r>
-      <w:r>
-        <w:t xml:space="preserve"> </w:t>
-      </w:r>
-      <w:r>
-        <w:t xml:space="preserve">contains a responsive React, Vite, JavaScript, and CSS dashboard. It integrates with the real</w:t>
+        <w:t xml:space="preserve">62bef8f</w:t>
+      </w:r>
+      <w:r>
+        <w:t xml:space="preserve">,</w:t>
       </w:r>
       <w:r>
         <w:t xml:space="preserve"> </w:t>
@@ -2834,13 +2794,82 @@
         <w:rPr>
           <w:rStyle w:val="VerbatimChar"/>
         </w:rPr>
+        <w:t xml:space="preserve">abd5fae</w:t>
+      </w:r>
+      <w:r>
+        <w:t xml:space="preserve">, and</w:t>
+      </w:r>
+      <w:r>
+        <w:t xml:space="preserve"> </w:t>
+      </w:r>
+      <w:r>
+        <w:rPr>
+          <w:rStyle w:val="VerbatimChar"/>
+        </w:rPr>
+        <w:t xml:space="preserve">bc47a81</w:t>
+      </w:r>
+      <w:r>
+        <w:t xml:space="preserve">, the three-persona integration-test commit</w:t>
+      </w:r>
+      <w:r>
+        <w:t xml:space="preserve"> </w:t>
+      </w:r>
+      <w:r>
+        <w:rPr>
+          <w:rStyle w:val="VerbatimChar"/>
+        </w:rPr>
+        <w:t xml:space="preserve">bce6451</w:t>
+      </w:r>
+      <w:r>
+        <w:t xml:space="preserve">, and CORS integration commit</w:t>
+      </w:r>
+      <w:r>
+        <w:t xml:space="preserve"> </w:t>
+      </w:r>
+      <w:r>
+        <w:rPr>
+          <w:rStyle w:val="VerbatimChar"/>
+        </w:rPr>
+        <w:t xml:space="preserve">0122245</w:t>
+      </w:r>
+      <w:r>
+        <w:t xml:space="preserve">. The Python, FastAPI, Pydantic, and Pytest backend provides</w:t>
+      </w:r>
+      <w:r>
+        <w:t xml:space="preserve"> </w:t>
+      </w:r>
+      <w:r>
+        <w:rPr>
+          <w:rStyle w:val="VerbatimChar"/>
+        </w:rPr>
+        <w:t xml:space="preserve">GET /</w:t>
+      </w:r>
+      <w:r>
+        <w:t xml:space="preserve">,</w:t>
+      </w:r>
+      <w:r>
+        <w:t xml:space="preserve"> </w:t>
+      </w:r>
+      <w:r>
+        <w:rPr>
+          <w:rStyle w:val="VerbatimChar"/>
+        </w:rPr>
+        <w:t xml:space="preserve">GET /health</w:t>
+      </w:r>
+      <w:r>
+        <w:t xml:space="preserve">, and</w:t>
+      </w:r>
+      <w:r>
+        <w:t xml:space="preserve"> </w:t>
+      </w:r>
+      <w:r>
+        <w:rPr>
+          <w:rStyle w:val="VerbatimChar"/>
+        </w:rPr>
         <w:t xml:space="preserve">POST /score</w:t>
       </w:r>
       <w:r>
-        <w:t xml:space="preserve"> </w:t>
-      </w:r>
-      <w:r>
-        <w:t xml:space="preserve">endpoint and presents an applicant assessment form, creditworthiness gauge, dynamic factor breakdown, risk flags, confidence and data-quality indicators, evidence views, API loading and error states, and a human-review interface.</w:t>
+        <w:t xml:space="preserve">.</w:t>
       </w:r>
     </w:p>
     <w:p>
@@ -2850,24 +2879,11 @@
         <w:jc w:val="both"/>
       </w:pPr>
       <w:r>
-        <w:t xml:space="preserve">Member 3 reported that ESLint and the production build passed and that a live local assessment returned</w:t>
-      </w:r>
-      <w:r>
-        <w:t xml:space="preserve"> </w:t>
-      </w:r>
-      <w:r>
-        <w:rPr>
-          <w:b/>
-          <w:bCs/>
-        </w:rPr>
-        <w:t xml:space="preserve">782 — Strong</w:t>
-      </w:r>
-      <w:r>
-        <w:t xml:space="preserve">. No additional facts about that particular applicant are inferred. The review interaction is implemented in the frontend MVP, while persistent server-side review history is not established.</w:t>
-      </w:r>
-    </w:p>
-    <w:bookmarkEnd w:id="36"/>
-    <w:bookmarkStart w:id="37" w:name="frontendbackend-integration"/>
+        <w:t xml:space="preserve">The API validates request bounds; calculates a deterministic score from 300 to 900; returns assessment bands, factor-level point contributions, explanations, and evidence values; preserves the pipeline's data-quality object; reports feature-completeness confidence separately; and generates risk flags. When a feature is genuinely unavailable, its scoring weight is excluded and the remaining factor weights are normalized. Factor points always reconcile with the final score.</w:t>
+      </w:r>
+    </w:p>
+    <w:bookmarkEnd w:id="34"/>
+    <w:bookmarkStart w:id="35" w:name="member-3--react-lender-dashboard"/>
     <w:p>
       <w:pPr>
         <w:pStyle w:val="Heading4"/>
@@ -2875,6 +2891,96 @@
         <w:keepLines/>
       </w:pPr>
       <w:r>
+        <w:t xml:space="preserve">Member 3 — React lender dashboard</w:t>
+      </w:r>
+    </w:p>
+    <w:p>
+      <w:pPr>
+        <w:pStyle w:val="FirstParagraph"/>
+        <w:widowControl/>
+        <w:jc w:val="both"/>
+      </w:pPr>
+      <w:r>
+        <w:t xml:space="preserve">The</w:t>
+      </w:r>
+      <w:r>
+        <w:t xml:space="preserve"> </w:t>
+      </w:r>
+      <w:r>
+        <w:rPr>
+          <w:rStyle w:val="VerbatimChar"/>
+        </w:rPr>
+        <w:t xml:space="preserve">feature/lender-dashboard</w:t>
+      </w:r>
+      <w:r>
+        <w:t xml:space="preserve"> </w:t>
+      </w:r>
+      <w:r>
+        <w:t xml:space="preserve">branch at reported commit</w:t>
+      </w:r>
+      <w:r>
+        <w:t xml:space="preserve"> </w:t>
+      </w:r>
+      <w:r>
+        <w:rPr>
+          <w:rStyle w:val="VerbatimChar"/>
+        </w:rPr>
+        <w:t xml:space="preserve">2448073</w:t>
+      </w:r>
+      <w:r>
+        <w:t xml:space="preserve"> </w:t>
+      </w:r>
+      <w:r>
+        <w:t xml:space="preserve">contains a responsive React, Vite, JavaScript, and CSS dashboard. It integrates with the real</w:t>
+      </w:r>
+      <w:r>
+        <w:t xml:space="preserve"> </w:t>
+      </w:r>
+      <w:r>
+        <w:rPr>
+          <w:rStyle w:val="VerbatimChar"/>
+        </w:rPr>
+        <w:t xml:space="preserve">POST /score</w:t>
+      </w:r>
+      <w:r>
+        <w:t xml:space="preserve"> </w:t>
+      </w:r>
+      <w:r>
+        <w:t xml:space="preserve">endpoint and presents an applicant assessment form, creditworthiness gauge, dynamic factor breakdown, risk flags, confidence and data-quality indicators, evidence views, API loading and error states, and a human-review interface.</w:t>
+      </w:r>
+    </w:p>
+    <w:p>
+      <w:pPr>
+        <w:pStyle w:val="BodyText"/>
+        <w:widowControl/>
+        <w:jc w:val="both"/>
+      </w:pPr>
+      <w:r>
+        <w:t xml:space="preserve">Member 3 reported that ESLint and the production build passed and that a live local assessment returned</w:t>
+      </w:r>
+      <w:r>
+        <w:t xml:space="preserve"> </w:t>
+      </w:r>
+      <w:r>
+        <w:rPr>
+          <w:b/>
+          <w:bCs/>
+        </w:rPr>
+        <w:t xml:space="preserve">782 — Strong</w:t>
+      </w:r>
+      <w:r>
+        <w:t xml:space="preserve">. No additional facts about that particular applicant are inferred. The review interaction is implemented in the frontend MVP, while persistent server-side review history is not established.</w:t>
+      </w:r>
+    </w:p>
+    <w:bookmarkEnd w:id="35"/>
+    <w:bookmarkStart w:id="36" w:name="frontendbackend-integration"/>
+    <w:p>
+      <w:pPr>
+        <w:pStyle w:val="Heading4"/>
+        <w:keepNext/>
+        <w:keepLines/>
+      </w:pPr>
+      <w:r>
         <w:t xml:space="preserve">Frontend–backend integration</w:t>
       </w:r>
     </w:p>
@@ -2969,9 +3075,9 @@
         <w:t xml:space="preserve">allowed. The backend CORS preflight returned HTTP 200, and all eight backend tests continued to pass after the change.</w:t>
       </w:r>
     </w:p>
+    <w:bookmarkEnd w:id="36"/>
     <w:bookmarkEnd w:id="37"/>
-    <w:bookmarkEnd w:id="38"/>
-    <w:bookmarkStart w:id="39" w:name="implementation-and-validation-results"/>
+    <w:bookmarkStart w:id="38" w:name="implementation-and-validation-results"/>
     <w:p>
       <w:pPr>
         <w:pStyle w:val="Heading3"/>
@@ -3724,8 +3830,8 @@
         <w:t xml:space="preserve">assessment. EarnScore therefore distinguishes “we have reliable evidence” from “the evidence describes a stable earning pattern.”</w:t>
       </w:r>
     </w:p>
-    <w:bookmarkEnd w:id="39"/>
-    <w:bookmarkStart w:id="40" w:name="capability-status-and-mvp-limitations"/>
+    <w:bookmarkEnd w:id="38"/>
+    <w:bookmarkStart w:id="39" w:name="capability-status-and-mvp-limitations"/>
     <w:p>
       <w:pPr>
         <w:pStyle w:val="Heading3"/>
@@ -3999,8 +4105,8 @@
         <w:t xml:space="preserve">The MVP uses simulated transactions and deterministic, explainable rules. It does not perform automated lending approval, claim regulatory certification, or predict a calibrated probability of default. Comparing the three fixed personas demonstrates differences in financial patterns; the current MVP does not implement a general counterfactual-analysis engine. The components were tested locally and across their defined API contract. Because the three feature branches have not been represented here as a single verified release build, this report does not claim final merged-release verification.</w:t>
       </w:r>
     </w:p>
-    <w:bookmarkEnd w:id="40"/>
-    <w:bookmarkStart w:id="41" w:name="demonstration-scenarios"/>
+    <w:bookmarkEnd w:id="39"/>
+    <w:bookmarkStart w:id="40" w:name="demonstration-scenarios"/>
     <w:p>
       <w:pPr>
         <w:pStyle w:val="Heading3"/>
@@ -4009,231 +4115,6 @@
       </w:pPr>
       <w:r>
         <w:t xml:space="preserve">Demonstration scenarios</w:t>
-      </w:r>
-    </w:p>
-    <w:p>
-      <w:pPr>
-        <w:pStyle w:val="Compact"/>
-        <w:widowControl/>
-        <w:numPr>
-          <w:ilvl w:val="0"/>
-          <w:numId w:val="1005"/>
-        </w:numPr>
-      </w:pPr>
-      <w:r>
-        <w:rPr>
-          <w:b/>
-          <w:bCs/>
-        </w:rPr>
-        <w:t xml:space="preserve">Stable multi-platform worker:</w:t>
-      </w:r>
-      <w:r>
-        <w:t xml:space="preserve"> </w:t>
-      </w:r>
-      <w:r>
-        <w:t xml:space="preserve">moderate income, regular earnings, multiple sources, and healthy cash flow.</w:t>
-      </w:r>
-    </w:p>
-    <w:p>
-      <w:pPr>
-        <w:pStyle w:val="Compact"/>
-        <w:widowControl/>
-        <w:numPr>
-          <w:ilvl w:val="0"/>
-          <w:numId w:val="1005"/>
-        </w:numPr>
-      </w:pPr>
-      <w:r>
-        <w:rPr>
-          <w:b/>
-          <w:bCs/>
-        </w:rPr>
-        <w:t xml:space="preserve">High-income but volatile worker:</w:t>
-      </w:r>
-      <w:r>
-        <w:t xml:space="preserve"> </w:t>
-      </w:r>
-      <w:r>
-        <w:t xml:space="preserve">higher total income with long gaps and concentrated payments.</w:t>
-      </w:r>
-    </w:p>
-    <w:p>
-      <w:pPr>
-        <w:pStyle w:val="Compact"/>
-        <w:widowControl/>
-        <w:numPr>
-          <w:ilvl w:val="0"/>
-          <w:numId w:val="1005"/>
-        </w:numPr>
-      </w:pPr>
-      <w:r>
-        <w:rPr>
-          <w:b/>
-          <w:bCs/>
-        </w:rPr>
-        <w:t xml:space="preserve">New or seasonal worker:</w:t>
-      </w:r>
-      <w:r>
-        <w:t xml:space="preserve"> </w:t>
-      </w:r>
-      <w:r>
-        <w:t xml:space="preserve">valid earnings but limited history, producing lower confidence and a request for more information.</w:t>
-      </w:r>
-    </w:p>
-    <w:p>
-      <w:pPr>
-        <w:pStyle w:val="FirstParagraph"/>
-        <w:widowControl/>
-        <w:jc w:val="both"/>
-      </w:pPr>
-      <w:r>
-        <w:t xml:space="preserve">These scenarios demonstrate that EarnScore rewards the quality and resilience of earning patterns rather than simply favoring the applicant with the highest income.</w:t>
-      </w:r>
-    </w:p>
-    <w:bookmarkEnd w:id="41"/>
-    <w:bookmarkEnd w:id="42"/>
-    <w:bookmarkStart w:id="48" w:name="X843d442355a0d838ec32fb9e05b3f4dd6cf9a41"/>
-    <w:p>
-      <w:pPr>
-        <w:pStyle w:val="Heading2"/>
-        <w:keepNext/>
-        <w:keepLines/>
-      </w:pPr>
-      <w:r>
-        <w:t xml:space="preserve">4. Novelty</w:t>
-      </w:r>
-    </w:p>
-    <w:bookmarkStart w:id="43" w:name="X9c1fef61d3d775d48f112abf9a7c150d28e1a9f"/>
-    <w:p>
-      <w:pPr>
-        <w:pStyle w:val="Heading3"/>
-        <w:keepNext/>
-        <w:keepLines/>
-      </w:pPr>
-      <w:r>
-        <w:t xml:space="preserve">A unified earning identity instead of a salary substitute</w:t>
-      </w:r>
-    </w:p>
-    <w:p>
-      <w:pPr>
-        <w:pStyle w:val="FirstParagraph"/>
-        <w:widowControl/>
-        <w:jc w:val="both"/>
-      </w:pPr>
-      <w:r>
-        <w:t xml:space="preserve">EarnScore does more than estimate a monthly salary from bank credits. It constructs a consolidated earning profile from several fragmented sources and evaluates how those sources behave together over time.</w:t>
-      </w:r>
-    </w:p>
-    <w:bookmarkEnd w:id="43"/>
-    <w:bookmarkStart w:id="44" w:name="X5b5c3bf13567c2c6629882f5bd6b439fa840dc7"/>
-    <w:p>
-      <w:pPr>
-        <w:pStyle w:val="Heading3"/>
-        <w:keepNext/>
-        <w:keepLines/>
-      </w:pPr>
-      <w:r>
-        <w:t xml:space="preserve">Score and confidence are intentionally separate</w:t>
-      </w:r>
-    </w:p>
-    <w:p>
-      <w:pPr>
-        <w:pStyle w:val="FirstParagraph"/>
-        <w:widowControl/>
-        <w:jc w:val="both"/>
-      </w:pPr>
-      <w:r>
-        <w:t xml:space="preserve">Many scoring interfaces present a single authoritative number. EarnScore presents both the financial assessment and the strength of the underlying evidence. A promising pattern supported by incomplete data remains visible, but the system clearly asks the lender for more information.</w:t>
-      </w:r>
-    </w:p>
-    <w:bookmarkEnd w:id="44"/>
-    <w:bookmarkStart w:id="45" w:name="every-factor-is-evidence-backed"/>
-    <w:p>
-      <w:pPr>
-        <w:pStyle w:val="Heading3"/>
-        <w:keepNext/>
-        <w:keepLines/>
-      </w:pPr>
-      <w:r>
-        <w:t xml:space="preserve">Every factor is evidence-backed</w:t>
-      </w:r>
-    </w:p>
-    <w:p>
-      <w:pPr>
-        <w:pStyle w:val="FirstParagraph"/>
-        <w:widowControl/>
-        <w:jc w:val="both"/>
-      </w:pPr>
-      <w:r>
-        <w:t xml:space="preserve">A lender can open a factor, read its plain-language explanation, and inspect the values that produced its points. For example, income-consistency points can show that earnings were observed in 11 of 12 months. This makes the result easier to challenge, audit, and explain to an applicant.</w:t>
-      </w:r>
-    </w:p>
-    <w:bookmarkEnd w:id="45"/>
-    <w:bookmarkStart w:id="46" w:name="stability-can-outweigh-absolute-income"/>
-    <w:p>
-      <w:pPr>
-        <w:pStyle w:val="Heading3"/>
-        <w:keepNext/>
-        <w:keepLines/>
-      </w:pPr>
-      <w:r>
-        <w:t xml:space="preserve">Stability can outweigh absolute income</w:t>
-      </w:r>
-    </w:p>
-    <w:p>
-      <w:pPr>
-        <w:pStyle w:val="FirstParagraph"/>
-        <w:widowControl/>
-        <w:jc w:val="both"/>
-      </w:pPr>
-      <w:r>
-        <w:t xml:space="preserve">The design deliberately allows a lower-income but consistent worker to score better than a higher-income worker with extreme volatility. This aligns the assessment with sustainable repayment capacity and makes the system relevant to gig work rather than reproducing salary-based ranking.</w:t>
-      </w:r>
-    </w:p>
-    <w:bookmarkEnd w:id="46"/>
-    <w:bookmarkStart w:id="47" w:name="Xf00f8888577fa2084763d13a847498ce9d39e43"/>
-    <w:p>
-      <w:pPr>
-        <w:pStyle w:val="Heading3"/>
-        <w:keepNext/>
-        <w:keepLines/>
-      </w:pPr>
-      <w:r>
-        <w:t xml:space="preserve">Human judgment is part of the product flow</w:t>
-      </w:r>
-    </w:p>
-    <w:p>
-      <w:pPr>
-        <w:pStyle w:val="FirstParagraph"/>
-        <w:widowControl/>
-        <w:jc w:val="both"/>
-      </w:pPr>
-      <w:r>
-        <w:t xml:space="preserve">EarnScore records the lender's review separately from the calculated score. It supports structured decision-making while preventing the score from being presented as an automatic approval or rejection engine.</w:t>
-      </w:r>
-    </w:p>
-    <w:bookmarkEnd w:id="47"/>
-    <w:bookmarkEnd w:id="48"/>
-    <w:bookmarkStart w:id="52" w:name="Xad882fcfee705624e0d53244a75e0f93b33b53d"/>
-    <w:p>
-      <w:pPr>
-        <w:pStyle w:val="Heading2"/>
-        <w:keepNext/>
-        <w:keepLines/>
-      </w:pPr>
-      <w:r>
-        <w:t xml:space="preserve">5. Innovation</w:t>
-      </w:r>
-    </w:p>
-    <w:bookmarkStart w:id="49" w:name="technical-innovation"/>
-    <w:p>
-      <w:pPr>
-        <w:pStyle w:val="Heading3"/>
-        <w:keepNext/>
-        <w:keepLines/>
-      </w:pPr>
-      <w:r>
-        <w:t xml:space="preserve">Technical innovation</w:t>
       </w:r>
     </w:p>
     <w:p>
@@ -4250,13 +4131,13 @@
           <w:b/>
           <w:bCs/>
         </w:rPr>
-        <w:t xml:space="preserve">Multi-source normalization:</w:t>
-      </w:r>
-      <w:r>
-        <w:t xml:space="preserve"> </w:t>
-      </w:r>
-      <w:r>
-        <w:t xml:space="preserve">Converts different platform and account formats into one auditable transaction timeline.</w:t>
+        <w:t xml:space="preserve">Stable multi-platform worker:</w:t>
+      </w:r>
+      <w:r>
+        <w:t xml:space="preserve"> </w:t>
+      </w:r>
+      <w:r>
+        <w:t xml:space="preserve">moderate income, regular earnings, multiple sources, and healthy cash flow.</w:t>
       </w:r>
     </w:p>
     <w:p>
@@ -4273,13 +4154,13 @@
           <w:b/>
           <w:bCs/>
         </w:rPr>
-        <w:t xml:space="preserve">Transfer and reversal handling:</w:t>
-      </w:r>
-      <w:r>
-        <w:t xml:space="preserve"> </w:t>
-      </w:r>
-      <w:r>
-        <w:t xml:space="preserve">Reduces false income inflation by identifying duplicates, refunds, reversals, and transfers between an applicant's own accounts.</w:t>
+        <w:t xml:space="preserve">High-income but volatile worker:</w:t>
+      </w:r>
+      <w:r>
+        <w:t xml:space="preserve"> </w:t>
+      </w:r>
+      <w:r>
+        <w:t xml:space="preserve">higher total income with long gaps and concentrated payments.</w:t>
       </w:r>
     </w:p>
     <w:p>
@@ -4296,63 +4177,39 @@
           <w:b/>
           <w:bCs/>
         </w:rPr>
-        <w:t xml:space="preserve">Resilience features:</w:t>
-      </w:r>
-      <w:r>
-        <w:t xml:space="preserve"> </w:t>
-      </w:r>
-      <w:r>
-        <w:t xml:space="preserve">Measures source concentration, positive-cash-flow frequency, income gaps, volatility, trends, and buffer days rather than relying on one aggregate income figure.</w:t>
-      </w:r>
-    </w:p>
-    <w:p>
-      <w:pPr>
-        <w:pStyle w:val="Compact"/>
-        <w:widowControl/>
-        <w:numPr>
-          <w:ilvl w:val="0"/>
-          <w:numId w:val="1006"/>
-        </w:numPr>
-      </w:pPr>
-      <w:r>
-        <w:rPr>
-          <w:b/>
-          <w:bCs/>
-        </w:rPr>
-        <w:t xml:space="preserve">Confidence engine:</w:t>
-      </w:r>
-      <w:r>
-        <w:t xml:space="preserve"> </w:t>
-      </w:r>
-      <w:r>
-        <w:t xml:space="preserve">Changes certainty based on data completeness and quality instead of hiding missing evidence inside the score.</w:t>
-      </w:r>
-    </w:p>
-    <w:p>
-      <w:pPr>
-        <w:pStyle w:val="Compact"/>
-        <w:widowControl/>
-        <w:numPr>
-          <w:ilvl w:val="0"/>
-          <w:numId w:val="1006"/>
-        </w:numPr>
-      </w:pPr>
-      <w:r>
-        <w:rPr>
-          <w:b/>
-          <w:bCs/>
-        </w:rPr>
-        <w:t xml:space="preserve">Local demo mode:</w:t>
-      </w:r>
-      <w:r>
-        <w:t xml:space="preserve"> </w:t>
-      </w:r>
-      <w:r>
-        <w:t xml:space="preserve">Uses reproducible fixtures so the full product remains demonstrable without live bank integrations or network access.</w:t>
-      </w:r>
-    </w:p>
-    <w:bookmarkEnd w:id="49"/>
-    <w:bookmarkStart w:id="50" w:name="product-innovation"/>
+        <w:t xml:space="preserve">New or seasonal worker:</w:t>
+      </w:r>
+      <w:r>
+        <w:t xml:space="preserve"> </w:t>
+      </w:r>
+      <w:r>
+        <w:t xml:space="preserve">valid earnings but limited history, producing lower confidence and a request for more information.</w:t>
+      </w:r>
+    </w:p>
+    <w:p>
+      <w:pPr>
+        <w:pStyle w:val="FirstParagraph"/>
+        <w:widowControl/>
+        <w:jc w:val="both"/>
+      </w:pPr>
+      <w:r>
+        <w:t xml:space="preserve">These scenarios demonstrate that EarnScore rewards the quality and resilience of earning patterns rather than simply favoring the applicant with the highest income.</w:t>
+      </w:r>
+    </w:p>
+    <w:bookmarkEnd w:id="40"/>
+    <w:bookmarkEnd w:id="41"/>
+    <w:bookmarkStart w:id="47" w:name="X843d442355a0d838ec32fb9e05b3f4dd6cf9a41"/>
+    <w:p>
+      <w:pPr>
+        <w:pStyle w:val="Heading2"/>
+        <w:keepNext/>
+        <w:keepLines/>
+      </w:pPr>
+      <w:r>
+        <w:t xml:space="preserve">4. Novelty</w:t>
+      </w:r>
+    </w:p>
+    <w:bookmarkStart w:id="42" w:name="X9c1fef61d3d775d48f112abf9a7c150d28e1a9f"/>
     <w:p>
       <w:pPr>
         <w:pStyle w:val="Heading3"/>
@@ -4360,7 +4217,129 @@
         <w:keepLines/>
       </w:pPr>
       <w:r>
-        <w:t xml:space="preserve">Product innovation</w:t>
+        <w:t xml:space="preserve">A unified earning identity instead of a salary substitute</w:t>
+      </w:r>
+    </w:p>
+    <w:p>
+      <w:pPr>
+        <w:pStyle w:val="FirstParagraph"/>
+        <w:widowControl/>
+        <w:jc w:val="both"/>
+      </w:pPr>
+      <w:r>
+        <w:t xml:space="preserve">EarnScore does more than estimate a monthly salary from bank credits. It constructs a consolidated earning profile from several fragmented sources and evaluates how those sources behave together over time.</w:t>
+      </w:r>
+    </w:p>
+    <w:bookmarkEnd w:id="42"/>
+    <w:bookmarkStart w:id="43" w:name="X5b5c3bf13567c2c6629882f5bd6b439fa840dc7"/>
+    <w:p>
+      <w:pPr>
+        <w:pStyle w:val="Heading3"/>
+        <w:keepNext/>
+        <w:keepLines/>
+      </w:pPr>
+      <w:r>
+        <w:t xml:space="preserve">Score and confidence are intentionally separate</w:t>
+      </w:r>
+    </w:p>
+    <w:p>
+      <w:pPr>
+        <w:pStyle w:val="FirstParagraph"/>
+        <w:widowControl/>
+        <w:jc w:val="both"/>
+      </w:pPr>
+      <w:r>
+        <w:t xml:space="preserve">Many scoring interfaces present a single authoritative number. EarnScore presents both the financial assessment and the strength of the underlying evidence. A promising pattern supported by incomplete data remains visible, but the system clearly asks the lender for more information.</w:t>
+      </w:r>
+    </w:p>
+    <w:bookmarkEnd w:id="43"/>
+    <w:bookmarkStart w:id="44" w:name="every-factor-is-evidence-backed"/>
+    <w:p>
+      <w:pPr>
+        <w:pStyle w:val="Heading3"/>
+        <w:keepNext/>
+        <w:keepLines/>
+      </w:pPr>
+      <w:r>
+        <w:t xml:space="preserve">Every factor is evidence-backed</w:t>
+      </w:r>
+    </w:p>
+    <w:p>
+      <w:pPr>
+        <w:pStyle w:val="FirstParagraph"/>
+        <w:widowControl/>
+        <w:jc w:val="both"/>
+      </w:pPr>
+      <w:r>
+        <w:t xml:space="preserve">A lender can open a factor, read its plain-language explanation, and inspect the values that produced its points. For example, income-consistency points can show that earnings were observed in 11 of 12 months. This makes the result easier to challenge, audit, and explain to an applicant.</w:t>
+      </w:r>
+    </w:p>
+    <w:bookmarkEnd w:id="44"/>
+    <w:bookmarkStart w:id="45" w:name="stability-can-outweigh-absolute-income"/>
+    <w:p>
+      <w:pPr>
+        <w:pStyle w:val="Heading3"/>
+        <w:keepNext/>
+        <w:keepLines/>
+      </w:pPr>
+      <w:r>
+        <w:t xml:space="preserve">Stability can outweigh absolute income</w:t>
+      </w:r>
+    </w:p>
+    <w:p>
+      <w:pPr>
+        <w:pStyle w:val="FirstParagraph"/>
+        <w:widowControl/>
+        <w:jc w:val="both"/>
+      </w:pPr>
+      <w:r>
+        <w:t xml:space="preserve">The design deliberately allows a lower-income but consistent worker to score better than a higher-income worker with extreme volatility. This aligns the assessment with sustainable repayment capacity and makes the system relevant to gig work rather than reproducing salary-based ranking.</w:t>
+      </w:r>
+    </w:p>
+    <w:bookmarkEnd w:id="45"/>
+    <w:bookmarkStart w:id="46" w:name="Xf00f8888577fa2084763d13a847498ce9d39e43"/>
+    <w:p>
+      <w:pPr>
+        <w:pStyle w:val="Heading3"/>
+        <w:keepNext/>
+        <w:keepLines/>
+      </w:pPr>
+      <w:r>
+        <w:t xml:space="preserve">Human judgment is part of the product flow</w:t>
+      </w:r>
+    </w:p>
+    <w:p>
+      <w:pPr>
+        <w:pStyle w:val="FirstParagraph"/>
+        <w:widowControl/>
+        <w:jc w:val="both"/>
+      </w:pPr>
+      <w:r>
+        <w:t xml:space="preserve">EarnScore records the lender's review separately from the calculated score. It supports structured decision-making while preventing the score from being presented as an automatic approval or rejection engine.</w:t>
+      </w:r>
+    </w:p>
+    <w:bookmarkEnd w:id="46"/>
+    <w:bookmarkEnd w:id="47"/>
+    <w:bookmarkStart w:id="51" w:name="Xad882fcfee705624e0d53244a75e0f93b33b53d"/>
+    <w:p>
+      <w:pPr>
+        <w:pStyle w:val="Heading2"/>
+        <w:keepNext/>
+        <w:keepLines/>
+      </w:pPr>
+      <w:r>
+        <w:t xml:space="preserve">5. Innovation</w:t>
+      </w:r>
+    </w:p>
+    <w:bookmarkStart w:id="48" w:name="technical-innovation"/>
+    <w:p>
+      <w:pPr>
+        <w:pStyle w:val="Heading3"/>
+        <w:keepNext/>
+        <w:keepLines/>
+      </w:pPr>
+      <w:r>
+        <w:t xml:space="preserve">Technical innovation</w:t>
       </w:r>
     </w:p>
     <w:p>
@@ -4377,13 +4356,13 @@
           <w:b/>
           <w:bCs/>
         </w:rPr>
-        <w:t xml:space="preserve">Raw-to-understood transformation:</w:t>
-      </w:r>
-      <w:r>
-        <w:t xml:space="preserve"> </w:t>
-      </w:r>
-      <w:r>
-        <w:t xml:space="preserve">The data pipeline converts scattered simulated payments into a coherent feature payload, and the dashboard presents the resulting API assessment.</w:t>
+        <w:t xml:space="preserve">Multi-source normalization:</w:t>
+      </w:r>
+      <w:r>
+        <w:t xml:space="preserve"> </w:t>
+      </w:r>
+      <w:r>
+        <w:t xml:space="preserve">Converts different platform and account formats into one auditable transaction timeline.</w:t>
       </w:r>
     </w:p>
     <w:p>
@@ -4400,13 +4379,13 @@
           <w:b/>
           <w:bCs/>
         </w:rPr>
-        <w:t xml:space="preserve">Counterfactual comparison:</w:t>
-      </w:r>
-      <w:r>
-        <w:t xml:space="preserve"> </w:t>
-      </w:r>
-      <w:r>
-        <w:t xml:space="preserve">Judges and lenders can compare a stable moderate-income profile with a volatile high-income profile to understand the model's priorities.</w:t>
+        <w:t xml:space="preserve">Transfer and reversal handling:</w:t>
+      </w:r>
+      <w:r>
+        <w:t xml:space="preserve"> </w:t>
+      </w:r>
+      <w:r>
+        <w:t xml:space="preserve">Reduces false income inflation by identifying duplicates, refunds, reversals, and transfers between an applicant's own accounts.</w:t>
       </w:r>
     </w:p>
     <w:p>
@@ -4423,13 +4402,13 @@
           <w:b/>
           <w:bCs/>
         </w:rPr>
-        <w:t xml:space="preserve">Explainable risk flags:</w:t>
-      </w:r>
-      <w:r>
-        <w:t xml:space="preserve"> </w:t>
-      </w:r>
-      <w:r>
-        <w:t xml:space="preserve">The scoring API identifies high income volatility, high expense-to-income ratio, irregular income activity, and unavailable emergency-buffer data using explicit thresholds.</w:t>
+        <w:t xml:space="preserve">Resilience features:</w:t>
+      </w:r>
+      <w:r>
+        <w:t xml:space="preserve"> </w:t>
+      </w:r>
+      <w:r>
+        <w:t xml:space="preserve">Measures source concentration, positive-cash-flow frequency, income gaps, volatility, trends, and buffer days rather than relying on one aggregate income figure.</w:t>
       </w:r>
     </w:p>
     <w:p>
@@ -4446,17 +4425,40 @@
           <w:b/>
           <w:bCs/>
         </w:rPr>
-        <w:t xml:space="preserve">Reviewable decision separation:</w:t>
-      </w:r>
-      <w:r>
-        <w:t xml:space="preserve"> </w:t>
-      </w:r>
-      <w:r>
-        <w:t xml:space="preserve">The MVP interface keeps the local human-review choice and notes distinct from model output, providing a design basis for future persistent audit and evaluation controls.</w:t>
-      </w:r>
-    </w:p>
-    <w:bookmarkEnd w:id="50"/>
-    <w:bookmarkStart w:id="51" w:name="responsible-innovation"/>
+        <w:t xml:space="preserve">Confidence engine:</w:t>
+      </w:r>
+      <w:r>
+        <w:t xml:space="preserve"> </w:t>
+      </w:r>
+      <w:r>
+        <w:t xml:space="preserve">Changes certainty based on data completeness and quality instead of hiding missing evidence inside the score.</w:t>
+      </w:r>
+    </w:p>
+    <w:p>
+      <w:pPr>
+        <w:pStyle w:val="Compact"/>
+        <w:widowControl/>
+        <w:numPr>
+          <w:ilvl w:val="0"/>
+          <w:numId w:val="1007"/>
+        </w:numPr>
+      </w:pPr>
+      <w:r>
+        <w:rPr>
+          <w:b/>
+          <w:bCs/>
+        </w:rPr>
+        <w:t xml:space="preserve">Local demo mode:</w:t>
+      </w:r>
+      <w:r>
+        <w:t xml:space="preserve"> </w:t>
+      </w:r>
+      <w:r>
+        <w:t xml:space="preserve">Uses reproducible fixtures so the full product remains demonstrable without live bank integrations or network access.</w:t>
+      </w:r>
+    </w:p>
+    <w:bookmarkEnd w:id="48"/>
+    <w:bookmarkStart w:id="49" w:name="product-innovation"/>
     <w:p>
       <w:pPr>
         <w:pStyle w:val="Heading3"/>
@@ -4464,7 +4466,7 @@
         <w:keepLines/>
       </w:pPr>
       <w:r>
-        <w:t xml:space="preserve">Responsible innovation</w:t>
+        <w:t xml:space="preserve">Product innovation</w:t>
       </w:r>
     </w:p>
     <w:p>
@@ -4477,7 +4479,17 @@
         </w:numPr>
       </w:pPr>
       <w:r>
-        <w:t xml:space="preserve">Uses financial-behavior signals relevant to the assessment purpose.</w:t>
+        <w:rPr>
+          <w:b/>
+          <w:bCs/>
+        </w:rPr>
+        <w:t xml:space="preserve">Raw-to-understood transformation:</w:t>
+      </w:r>
+      <w:r>
+        <w:t xml:space="preserve"> </w:t>
+      </w:r>
+      <w:r>
+        <w:t xml:space="preserve">The data pipeline converts scattered simulated payments into a coherent feature payload, and the dashboard presents the resulting API assessment.</w:t>
       </w:r>
     </w:p>
     <w:p>
@@ -4490,7 +4502,17 @@
         </w:numPr>
       </w:pPr>
       <w:r>
-        <w:t xml:space="preserve">Excludes protected attributes and unnecessary personal data.</w:t>
+        <w:rPr>
+          <w:b/>
+          <w:bCs/>
+        </w:rPr>
+        <w:t xml:space="preserve">Counterfactual comparison:</w:t>
+      </w:r>
+      <w:r>
+        <w:t xml:space="preserve"> </w:t>
+      </w:r>
+      <w:r>
+        <w:t xml:space="preserve">Judges and lenders can compare a stable moderate-income profile with a volatile high-income profile to understand the model's priorities.</w:t>
       </w:r>
     </w:p>
     <w:p>
@@ -4503,7 +4525,17 @@
         </w:numPr>
       </w:pPr>
       <w:r>
-        <w:t xml:space="preserve">Makes data gaps and uncertainty visible.</w:t>
+        <w:rPr>
+          <w:b/>
+          <w:bCs/>
+        </w:rPr>
+        <w:t xml:space="preserve">Explainable risk flags:</w:t>
+      </w:r>
+      <w:r>
+        <w:t xml:space="preserve"> </w:t>
+      </w:r>
+      <w:r>
+        <w:t xml:space="preserve">The scoring API identifies high income volatility, high expense-to-income ratio, irregular income activity, and unavailable emergency-buffer data using explicit thresholds.</w:t>
       </w:r>
     </w:p>
     <w:p>
@@ -4516,36 +4548,21 @@
         </w:numPr>
       </w:pPr>
       <w:r>
-        <w:t xml:space="preserve">Keeps human review visible in the decision flow.</w:t>
-      </w:r>
-    </w:p>
-    <w:p>
-      <w:pPr>
-        <w:pStyle w:val="Compact"/>
-        <w:widowControl/>
-        <w:numPr>
-          <w:ilvl w:val="0"/>
-          <w:numId w:val="1008"/>
-        </w:numPr>
-      </w:pPr>
-      <w:r>
-        <w:t xml:space="preserve">Presents understandable factor evidence; a formal applicant-dispute workflow remains a future enhancement.</w:t>
-      </w:r>
-    </w:p>
-    <w:bookmarkEnd w:id="51"/>
-    <w:bookmarkEnd w:id="52"/>
-    <w:bookmarkStart w:id="59" w:name="X2a11da496f1096189630a2e7a918cebdf950afa"/>
-    <w:p>
-      <w:pPr>
-        <w:pStyle w:val="Heading2"/>
-        <w:keepNext/>
-        <w:keepLines/>
-      </w:pPr>
-      <w:r>
-        <w:t xml:space="preserve">6. Market Research</w:t>
-      </w:r>
-    </w:p>
-    <w:bookmarkStart w:id="53" w:name="market-need"/>
+        <w:rPr>
+          <w:b/>
+          <w:bCs/>
+        </w:rPr>
+        <w:t xml:space="preserve">Reviewable decision separation:</w:t>
+      </w:r>
+      <w:r>
+        <w:t xml:space="preserve"> </w:t>
+      </w:r>
+      <w:r>
+        <w:t xml:space="preserve">The MVP interface keeps the local human-review choice and notes distinct from model output, providing a design basis for future persistent audit and evaluation controls.</w:t>
+      </w:r>
+    </w:p>
+    <w:bookmarkEnd w:id="49"/>
+    <w:bookmarkStart w:id="50" w:name="responsible-innovation"/>
     <w:p>
       <w:pPr>
         <w:pStyle w:val="Heading3"/>
@@ -4553,78 +4570,7 @@
         <w:keepLines/>
       </w:pPr>
       <w:r>
-        <w:t xml:space="preserve">Market need</w:t>
-      </w:r>
-    </w:p>
-    <w:p>
-      <w:pPr>
-        <w:pStyle w:val="FirstParagraph"/>
-        <w:widowControl/>
-        <w:jc w:val="both"/>
-      </w:pPr>
-      <w:r>
-        <w:t xml:space="preserve">India's platform and gig workforce is expanding while underwriting processes remain primarily designed around formal salary employment. NITI Aayog estimated approximately</w:t>
-      </w:r>
-      <w:r>
-        <w:t xml:space="preserve"> </w:t>
-      </w:r>
-      <w:r>
-        <w:rPr>
-          <w:b/>
-          <w:bCs/>
-        </w:rPr>
-        <w:t xml:space="preserve">7.7 million gig workers in 2020–21</w:t>
-      </w:r>
-      <w:r>
-        <w:t xml:space="preserve"> </w:t>
-      </w:r>
-      <w:r>
-        <w:t xml:space="preserve">and projected that the workforce could reach</w:t>
-      </w:r>
-      <w:r>
-        <w:t xml:space="preserve"> </w:t>
-      </w:r>
-      <w:r>
-        <w:rPr>
-          <w:b/>
-          <w:bCs/>
-        </w:rPr>
-        <w:t xml:space="preserve">23.5 million by 2029–30</w:t>
-      </w:r>
-      <w:r>
-        <w:t xml:space="preserve">. This growth creates a large population whose work is digitally recorded but whose income may not fit conventional documentation.</w:t>
-      </w:r>
-    </w:p>
-    <w:p>
-      <w:pPr>
-        <w:pStyle w:val="BodyText"/>
-        <w:widowControl/>
-        <w:jc w:val="both"/>
-      </w:pPr>
-      <w:r>
-        <w:t xml:space="preserve">At the same time, bank-account and digital-payment adoption has increased the amount of consentable cash-flow evidence available for analysis. India's Account Aggregator framework also provides a regulated direction for consent-based financial-data sharing. These developments make cash-flow underwriting more practical than it was when credit assessment depended mainly on paper salary records and prior loans.</w:t>
-      </w:r>
-    </w:p>
-    <w:bookmarkEnd w:id="53"/>
-    <w:bookmarkStart w:id="54" w:name="target-customers"/>
-    <w:p>
-      <w:pPr>
-        <w:pStyle w:val="Heading3"/>
-        <w:keepNext/>
-        <w:keepLines/>
-      </w:pPr>
-      <w:r>
-        <w:t xml:space="preserve">Target customers</w:t>
-      </w:r>
-    </w:p>
-    <w:p>
-      <w:pPr>
-        <w:pStyle w:val="FirstParagraph"/>
-        <w:widowControl/>
-        <w:jc w:val="both"/>
-      </w:pPr>
-      <w:r>
-        <w:t xml:space="preserve">The initial business-to-business customers are:</w:t>
+        <w:t xml:space="preserve">Responsible innovation</w:t>
       </w:r>
     </w:p>
     <w:p>
@@ -4637,7 +4583,7 @@
         </w:numPr>
       </w:pPr>
       <w:r>
-        <w:t xml:space="preserve">NBFCs and digital lenders serving self-employed or new-to-credit applicants</w:t>
+        <w:t xml:space="preserve">Uses financial-behavior signals relevant to the assessment purpose.</w:t>
       </w:r>
     </w:p>
     <w:p>
@@ -4650,7 +4596,7 @@
         </w:numPr>
       </w:pPr>
       <w:r>
-        <w:t xml:space="preserve">Banks developing small-ticket personal or productive-asset loans</w:t>
+        <w:t xml:space="preserve">Excludes protected attributes and unnecessary personal data.</w:t>
       </w:r>
     </w:p>
     <w:p>
@@ -4663,7 +4609,7 @@
         </w:numPr>
       </w:pPr>
       <w:r>
-        <w:t xml:space="preserve">Gig platforms offering worker benefits or embedded financial products</w:t>
+        <w:t xml:space="preserve">Makes data gaps and uncertainty visible.</w:t>
       </w:r>
     </w:p>
     <w:p>
@@ -4676,7 +4622,7 @@
         </w:numPr>
       </w:pPr>
       <w:r>
-        <w:t xml:space="preserve">FinTech infrastructure providers that want an explainable gig-income assessment module</w:t>
+        <w:t xml:space="preserve">Keeps human review visible in the decision flow.</w:t>
       </w:r>
     </w:p>
     <w:p>
@@ -4689,11 +4635,171 @@
         </w:numPr>
       </w:pPr>
       <w:r>
+        <w:t xml:space="preserve">Presents understandable factor evidence; a formal applicant-dispute workflow remains a future enhancement.</w:t>
+      </w:r>
+    </w:p>
+    <w:bookmarkEnd w:id="50"/>
+    <w:bookmarkEnd w:id="51"/>
+    <w:bookmarkStart w:id="63" w:name="X2a11da496f1096189630a2e7a918cebdf950afa"/>
+    <w:p>
+      <w:pPr>
+        <w:pStyle w:val="Heading2"/>
+        <w:keepNext/>
+        <w:keepLines/>
+      </w:pPr>
+      <w:r>
+        <w:t xml:space="preserve">6. Market Research</w:t>
+      </w:r>
+    </w:p>
+    <w:bookmarkStart w:id="52" w:name="market-need"/>
+    <w:p>
+      <w:pPr>
+        <w:pStyle w:val="Heading3"/>
+        <w:keepNext/>
+        <w:keepLines/>
+      </w:pPr>
+      <w:r>
+        <w:t xml:space="preserve">Market need</w:t>
+      </w:r>
+    </w:p>
+    <w:p>
+      <w:pPr>
+        <w:pStyle w:val="FirstParagraph"/>
+        <w:widowControl/>
+        <w:jc w:val="both"/>
+      </w:pPr>
+      <w:r>
+        <w:t xml:space="preserve">India's platform and gig workforce is expanding while underwriting processes remain primarily designed around formal salary employment. NITI Aayog estimated approximately</w:t>
+      </w:r>
+      <w:r>
+        <w:t xml:space="preserve"> </w:t>
+      </w:r>
+      <w:r>
+        <w:rPr>
+          <w:b/>
+          <w:bCs/>
+        </w:rPr>
+        <w:t xml:space="preserve">7.7 million gig workers in 2020–21</w:t>
+      </w:r>
+      <w:r>
+        <w:t xml:space="preserve"> </w:t>
+      </w:r>
+      <w:r>
+        <w:t xml:space="preserve">and projected that the workforce could reach</w:t>
+      </w:r>
+      <w:r>
+        <w:t xml:space="preserve"> </w:t>
+      </w:r>
+      <w:r>
+        <w:rPr>
+          <w:b/>
+          <w:bCs/>
+        </w:rPr>
+        <w:t xml:space="preserve">23.5 million by 2029–30</w:t>
+      </w:r>
+      <w:r>
+        <w:t xml:space="preserve">. This growth creates a large population whose work is digitally recorded but whose income may not fit conventional documentation.</w:t>
+      </w:r>
+    </w:p>
+    <w:p>
+      <w:pPr>
+        <w:pStyle w:val="BodyText"/>
+        <w:widowControl/>
+        <w:jc w:val="both"/>
+      </w:pPr>
+      <w:r>
+        <w:t xml:space="preserve">At the same time, bank-account and digital-payment adoption has increased the amount of consentable cash-flow evidence available for analysis. India's Account Aggregator framework also provides a regulated direction for consent-based financial-data sharing. These developments make cash-flow underwriting more practical than it was when credit assessment depended mainly on paper salary records and prior loans.</w:t>
+      </w:r>
+    </w:p>
+    <w:bookmarkEnd w:id="52"/>
+    <w:bookmarkStart w:id="53" w:name="target-customers"/>
+    <w:p>
+      <w:pPr>
+        <w:pStyle w:val="Heading3"/>
+        <w:keepNext/>
+        <w:keepLines/>
+      </w:pPr>
+      <w:r>
+        <w:t xml:space="preserve">Target customers</w:t>
+      </w:r>
+    </w:p>
+    <w:p>
+      <w:pPr>
+        <w:pStyle w:val="FirstParagraph"/>
+        <w:widowControl/>
+        <w:jc w:val="both"/>
+      </w:pPr>
+      <w:r>
+        <w:t xml:space="preserve">The initial business-to-business customers are:</w:t>
+      </w:r>
+    </w:p>
+    <w:p>
+      <w:pPr>
+        <w:pStyle w:val="Compact"/>
+        <w:widowControl/>
+        <w:numPr>
+          <w:ilvl w:val="0"/>
+          <w:numId w:val="1010"/>
+        </w:numPr>
+      </w:pPr>
+      <w:r>
+        <w:t xml:space="preserve">NBFCs and digital lenders serving self-employed or new-to-credit applicants</w:t>
+      </w:r>
+    </w:p>
+    <w:p>
+      <w:pPr>
+        <w:pStyle w:val="Compact"/>
+        <w:widowControl/>
+        <w:numPr>
+          <w:ilvl w:val="0"/>
+          <w:numId w:val="1010"/>
+        </w:numPr>
+      </w:pPr>
+      <w:r>
+        <w:t xml:space="preserve">Banks developing small-ticket personal or productive-asset loans</w:t>
+      </w:r>
+    </w:p>
+    <w:p>
+      <w:pPr>
+        <w:pStyle w:val="Compact"/>
+        <w:widowControl/>
+        <w:numPr>
+          <w:ilvl w:val="0"/>
+          <w:numId w:val="1010"/>
+        </w:numPr>
+      </w:pPr>
+      <w:r>
+        <w:t xml:space="preserve">Gig platforms offering worker benefits or embedded financial products</w:t>
+      </w:r>
+    </w:p>
+    <w:p>
+      <w:pPr>
+        <w:pStyle w:val="Compact"/>
+        <w:widowControl/>
+        <w:numPr>
+          <w:ilvl w:val="0"/>
+          <w:numId w:val="1010"/>
+        </w:numPr>
+      </w:pPr>
+      <w:r>
+        <w:t xml:space="preserve">FinTech infrastructure providers that want an explainable gig-income assessment module</w:t>
+      </w:r>
+    </w:p>
+    <w:p>
+      <w:pPr>
+        <w:pStyle w:val="Compact"/>
+        <w:widowControl/>
+        <w:numPr>
+          <w:ilvl w:val="0"/>
+          <w:numId w:val="1010"/>
+        </w:numPr>
+      </w:pPr>
+      <w:r>
         <w:t xml:space="preserve">Cooperatives and financial-inclusion programs evaluating non-salaried borrowers</w:t>
       </w:r>
     </w:p>
-    <w:bookmarkEnd w:id="54"/>
-    <w:bookmarkStart w:id="55" w:name="competitive-landscape"/>
+    <w:bookmarkEnd w:id="53"/>
+    <w:bookmarkStart w:id="54" w:name="competitive-landscape"/>
     <w:p>
       <w:pPr>
         <w:pStyle w:val="Heading3"/>
@@ -5239,8 +5345,8 @@
         </w:tc>
       </w:tr>
     </w:tbl>
-    <w:bookmarkEnd w:id="55"/>
-    <w:bookmarkStart w:id="56" w:name="positioning"/>
+    <w:bookmarkEnd w:id="54"/>
+    <w:bookmarkStart w:id="55" w:name="positioning"/>
     <w:p>
       <w:pPr>
         <w:pStyle w:val="Heading3"/>
@@ -5274,8 +5380,8 @@
         <w:t xml:space="preserve">, not as a lender or replacement for a credit bureau. It complements bureau history with current cash-flow evidence and gives analysts a consistent way to review non-salaried applicants.</w:t>
       </w:r>
     </w:p>
-    <w:bookmarkEnd w:id="56"/>
-    <w:bookmarkStart w:id="57" w:name="business-model"/>
+    <w:bookmarkEnd w:id="55"/>
+    <w:bookmarkStart w:id="56" w:name="business-model"/>
     <w:p>
       <w:pPr>
         <w:pStyle w:val="Heading3"/>
@@ -5294,70 +5400,6 @@
       </w:pPr>
       <w:r>
         <w:t xml:space="preserve">A production version could use a tiered B2B model:</w:t>
-      </w:r>
-    </w:p>
-    <w:p>
-      <w:pPr>
-        <w:pStyle w:val="Compact"/>
-        <w:widowControl/>
-        <w:numPr>
-          <w:ilvl w:val="0"/>
-          <w:numId w:val="1010"/>
-        </w:numPr>
-      </w:pPr>
-      <w:r>
-        <w:t xml:space="preserve">API fee per completed applicant analysis</w:t>
-      </w:r>
-    </w:p>
-    <w:p>
-      <w:pPr>
-        <w:pStyle w:val="Compact"/>
-        <w:widowControl/>
-        <w:numPr>
-          <w:ilvl w:val="0"/>
-          <w:numId w:val="1010"/>
-        </w:numPr>
-      </w:pPr>
-      <w:r>
-        <w:t xml:space="preserve">Monthly subscription for lender dashboard users</w:t>
-      </w:r>
-    </w:p>
-    <w:p>
-      <w:pPr>
-        <w:pStyle w:val="Compact"/>
-        <w:widowControl/>
-        <w:numPr>
-          <w:ilvl w:val="0"/>
-          <w:numId w:val="1010"/>
-        </w:numPr>
-      </w:pPr>
-      <w:r>
-        <w:t xml:space="preserve">Enterprise pricing for private deployment, custom policy rules, monitoring, and audit support</w:t>
-      </w:r>
-    </w:p>
-    <w:p>
-      <w:pPr>
-        <w:pStyle w:val="Compact"/>
-        <w:widowControl/>
-        <w:numPr>
-          <w:ilvl w:val="0"/>
-          <w:numId w:val="1010"/>
-        </w:numPr>
-      </w:pPr>
-      <w:r>
-        <w:t xml:space="preserve">Platform partnerships for embedded worker financial-wellness or credit-readiness tools</w:t>
-      </w:r>
-    </w:p>
-    <w:bookmarkEnd w:id="57"/>
-    <w:bookmarkStart w:id="58" w:name="go-to-market-sequence"/>
-    <w:p>
-      <w:pPr>
-        <w:pStyle w:val="Heading3"/>
-        <w:keepNext/>
-        <w:keepLines/>
-      </w:pPr>
-      <w:r>
-        <w:t xml:space="preserve">Go-to-market sequence</w:t>
       </w:r>
     </w:p>
     <w:p>
@@ -5370,7 +5412,7 @@
         </w:numPr>
       </w:pPr>
       <w:r>
-        <w:t xml:space="preserve">Pilot with one lender or gig platform using historical, consented, de-identified data.</w:t>
+        <w:t xml:space="preserve">API fee per completed applicant analysis</w:t>
       </w:r>
     </w:p>
     <w:p>
@@ -5383,7 +5425,7 @@
         </w:numPr>
       </w:pPr>
       <w:r>
-        <w:t xml:space="preserve">Validate whether EarnScore features improve review coverage and decision consistency.</w:t>
+        <w:t xml:space="preserve">Monthly subscription for lender dashboard users</w:t>
       </w:r>
     </w:p>
     <w:p>
@@ -5396,7 +5438,7 @@
         </w:numPr>
       </w:pPr>
       <w:r>
-        <w:t xml:space="preserve">Calibrate against repayment outcomes without removing explainability.</w:t>
+        <w:t xml:space="preserve">Enterprise pricing for private deployment, custom policy rules, monitoring, and audit support</w:t>
       </w:r>
     </w:p>
     <w:p>
@@ -5409,46 +5451,11 @@
         </w:numPr>
       </w:pPr>
       <w:r>
-        <w:t xml:space="preserve">Run fairness, stability, privacy, and regulatory assessments.</w:t>
-      </w:r>
-    </w:p>
-    <w:p>
-      <w:pPr>
-        <w:pStyle w:val="Compact"/>
-        <w:widowControl/>
-        <w:numPr>
-          <w:ilvl w:val="0"/>
-          <w:numId w:val="1011"/>
-        </w:numPr>
-      </w:pPr>
-      <w:r>
-        <w:t xml:space="preserve">Launch as a decision-support API and dashboard for a narrowly defined credit product.</w:t>
-      </w:r>
-    </w:p>
-    <w:p>
-      <w:pPr>
-        <w:pStyle w:val="FirstParagraph"/>
-        <w:widowControl/>
-        <w:jc w:val="both"/>
-      </w:pPr>
-      <w:r>
-        <w:t xml:space="preserve">The market evidence above is drawn from the primary publications listed in the References. The hackathon MVP does not claim proprietary market validation, customer validation, financial forecasts, regulatory certification, or a production-ready risk model.</w:t>
-      </w:r>
-    </w:p>
-    <w:bookmarkEnd w:id="58"/>
-    <w:bookmarkEnd w:id="59"/>
-    <w:bookmarkStart w:id="65" w:name="X93f250b8ac88c814716b20b105a72b2462a046b"/>
-    <w:p>
-      <w:pPr>
-        <w:pStyle w:val="Heading2"/>
-        <w:keepNext/>
-        <w:keepLines/>
-      </w:pPr>
-      <w:r>
-        <w:t xml:space="preserve">7. Impact</w:t>
-      </w:r>
-    </w:p>
-    <w:bookmarkStart w:id="60" w:name="impact-on-workers"/>
+        <w:t xml:space="preserve">Platform partnerships for embedded worker financial-wellness or credit-readiness tools</w:t>
+      </w:r>
+    </w:p>
+    <w:bookmarkEnd w:id="56"/>
+    <w:bookmarkStart w:id="57" w:name="go-to-market-sequence"/>
     <w:p>
       <w:pPr>
         <w:pStyle w:val="Heading3"/>
@@ -5456,7 +5463,7 @@
         <w:keepLines/>
       </w:pPr>
       <w:r>
-        <w:t xml:space="preserve">Impact on workers</w:t>
+        <w:t xml:space="preserve">Go-to-market sequence</w:t>
       </w:r>
     </w:p>
     <w:p>
@@ -5469,7 +5476,7 @@
         </w:numPr>
       </w:pPr>
       <w:r>
-        <w:t xml:space="preserve">Gives financially active workers a fairer opportunity to demonstrate earning capacity.</w:t>
+        <w:t xml:space="preserve">Pilot with one lender or gig platform using historical, consented, de-identified data.</w:t>
       </w:r>
     </w:p>
     <w:p>
@@ -5482,7 +5489,7 @@
         </w:numPr>
       </w:pPr>
       <w:r>
-        <w:t xml:space="preserve">Reduces dependence on salary slips and previous formal loans as the only acceptable evidence.</w:t>
+        <w:t xml:space="preserve">Validate whether EarnScore features improve review coverage and decision consistency.</w:t>
       </w:r>
     </w:p>
     <w:p>
@@ -5495,7 +5502,7 @@
         </w:numPr>
       </w:pPr>
       <w:r>
-        <w:t xml:space="preserve">Helps applicants understand which parts of their financial profile are strong, uncertain, or incomplete.</w:t>
+        <w:t xml:space="preserve">Calibrate against repayment outcomes without removing explainability.</w:t>
       </w:r>
     </w:p>
     <w:p>
@@ -5508,11 +5515,24 @@
         </w:numPr>
       </w:pPr>
       <w:r>
-        <w:t xml:space="preserve">Can support access to emergency credit, productive assets, education, insurance, and income-smoothing products.</w:t>
-      </w:r>
-    </w:p>
-    <w:bookmarkEnd w:id="60"/>
-    <w:bookmarkStart w:id="61" w:name="impact-on-lenders"/>
+        <w:t xml:space="preserve">Run fairness, stability, privacy, and regulatory assessments.</w:t>
+      </w:r>
+    </w:p>
+    <w:p>
+      <w:pPr>
+        <w:pStyle w:val="Compact"/>
+        <w:widowControl/>
+        <w:numPr>
+          <w:ilvl w:val="0"/>
+          <w:numId w:val="1012"/>
+        </w:numPr>
+      </w:pPr>
+      <w:r>
+        <w:t xml:space="preserve">Launch as a decision-support API and dashboard for a narrowly defined credit product.</w:t>
+      </w:r>
+    </w:p>
+    <w:bookmarkEnd w:id="57"/>
+    <w:bookmarkStart w:id="62" w:name="research-references"/>
     <w:p>
       <w:pPr>
         <w:pStyle w:val="Heading3"/>
@@ -5520,7 +5540,7 @@
         <w:keepLines/>
       </w:pPr>
       <w:r>
-        <w:t xml:space="preserve">Impact on lenders</w:t>
+        <w:t xml:space="preserve">Research references</w:t>
       </w:r>
     </w:p>
     <w:p>
@@ -5533,8 +5553,35 @@
         </w:numPr>
       </w:pPr>
       <w:r>
-        <w:t xml:space="preserve">Expands the assessable applicant pool while preserving structured review.</w:t>
-      </w:r>
+        <w:t xml:space="preserve">NITI Aayog,</w:t>
+      </w:r>
+      <w:r>
+        <w:t xml:space="preserve"> </w:t>
+      </w:r>
+      <w:r>
+        <w:rPr>
+          <w:i/>
+          <w:iCs/>
+        </w:rPr>
+        <w:t xml:space="preserve">India's Booming Gig and Platform Economy: Perspectives and Recommendations on the Future of Work</w:t>
+      </w:r>
+      <w:r>
+        <w:t xml:space="preserve"> </w:t>
+      </w:r>
+      <w:r>
+        <w:t xml:space="preserve">(June 2022): gig-workforce estimates and projections.</w:t>
+      </w:r>
+      <w:r>
+        <w:t xml:space="preserve"> </w:t>
+      </w:r>
+      <w:hyperlink r:id="rId58">
+        <w:r>
+          <w:rPr>
+            <w:rStyle w:val="Hyperlink"/>
+          </w:rPr>
+          <w:t xml:space="preserve">https://www.niti.gov.in/sites/default/files/2022-06/Policy_Brief_India%27s_Booming_Gig_and_Platform_Economy_27062022.pdf</w:t>
+        </w:r>
+      </w:hyperlink>
     </w:p>
     <w:p>
       <w:pPr>
@@ -5546,8 +5593,32 @@
         </w:numPr>
       </w:pPr>
       <w:r>
-        <w:t xml:space="preserve">Reduces manual effort required to interpret multiple statements and irregular payment patterns.</w:t>
-      </w:r>
+        <w:t xml:space="preserve">Reserve Bank of India,</w:t>
+      </w:r>
+      <w:r>
+        <w:t xml:space="preserve"> </w:t>
+      </w:r>
+      <w:r>
+        <w:rPr>
+          <w:i/>
+          <w:iCs/>
+        </w:rPr>
+        <w:t xml:space="preserve">Non-Banking Financial Company – Account Aggregator (Reserve Bank) Directions, 2016</w:t>
+      </w:r>
+      <w:r>
+        <w:t xml:space="preserve">: the regulatory framework for consent-based financial-data aggregation.</w:t>
+      </w:r>
+      <w:r>
+        <w:t xml:space="preserve"> </w:t>
+      </w:r>
+      <w:hyperlink r:id="rId59">
+        <w:r>
+          <w:rPr>
+            <w:rStyle w:val="Hyperlink"/>
+          </w:rPr>
+          <w:t xml:space="preserve">https://www.rbi.org.in/Scripts/NotificationUser.aspx?Id=10598</w:t>
+        </w:r>
+      </w:hyperlink>
     </w:p>
     <w:p>
       <w:pPr>
@@ -5559,8 +5630,32 @@
         </w:numPr>
       </w:pPr>
       <w:r>
-        <w:t xml:space="preserve">Provides consistent features, explanations, and data-quality warnings.</w:t>
-      </w:r>
+        <w:t xml:space="preserve">World Bank,</w:t>
+      </w:r>
+      <w:r>
+        <w:t xml:space="preserve"> </w:t>
+      </w:r>
+      <w:r>
+        <w:rPr>
+          <w:i/>
+          <w:iCs/>
+        </w:rPr>
+        <w:t xml:space="preserve">The Global Findex Database 2021: Financial Inclusion, Digital Payments, and Resilience in the Age of COVID-19</w:t>
+      </w:r>
+      <w:r>
+        <w:t xml:space="preserve">: financial-account ownership and digital-payment context.</w:t>
+      </w:r>
+      <w:r>
+        <w:t xml:space="preserve"> </w:t>
+      </w:r>
+      <w:hyperlink r:id="rId60">
+        <w:r>
+          <w:rPr>
+            <w:rStyle w:val="Hyperlink"/>
+          </w:rPr>
+          <w:t xml:space="preserve">https://www.worldbank.org/en/publication/globalfindex</w:t>
+        </w:r>
+      </w:hyperlink>
     </w:p>
     <w:p>
       <w:pPr>
@@ -5572,11 +5667,60 @@
         </w:numPr>
       </w:pPr>
       <w:r>
-        <w:t xml:space="preserve">Produces structured explanations and evidence that could support governance and customer communication when combined with production-grade persistent audit controls.</w:t>
-      </w:r>
-    </w:p>
-    <w:bookmarkEnd w:id="61"/>
-    <w:bookmarkStart w:id="62" w:name="wider-economic-and-social-impact"/>
+        <w:t xml:space="preserve">International Labour Organization,</w:t>
+      </w:r>
+      <w:r>
+        <w:t xml:space="preserve"> </w:t>
+      </w:r>
+      <w:r>
+        <w:rPr>
+          <w:i/>
+          <w:iCs/>
+        </w:rPr>
+        <w:t xml:space="preserve">World Employment and Social Outlook 2021: The Role of Digital Labour Platforms in Transforming the World of Work</w:t>
+      </w:r>
+      <w:r>
+        <w:t xml:space="preserve"> </w:t>
+      </w:r>
+      <w:r>
+        <w:t xml:space="preserve">(2021).</w:t>
+      </w:r>
+      <w:r>
+        <w:t xml:space="preserve"> </w:t>
+      </w:r>
+      <w:hyperlink r:id="rId61">
+        <w:r>
+          <w:rPr>
+            <w:rStyle w:val="Hyperlink"/>
+          </w:rPr>
+          <w:t xml:space="preserve">https://www.ilo.org/publications/flagship-reports/role-digital-labour-platforms-transforming-world-work</w:t>
+        </w:r>
+      </w:hyperlink>
+    </w:p>
+    <w:p>
+      <w:pPr>
+        <w:pStyle w:val="FirstParagraph"/>
+        <w:widowControl/>
+        <w:jc w:val="both"/>
+      </w:pPr>
+      <w:r>
+        <w:t xml:space="preserve">The market figures above should be rechecked against the linked primary publications before external submission or publication. The hackathon MVP does not claim proprietary market validation, customer validation, financial forecasts, regulatory certification, or a production-ready risk model.</w:t>
+      </w:r>
+    </w:p>
+    <w:bookmarkEnd w:id="62"/>
+    <w:bookmarkEnd w:id="63"/>
+    <w:bookmarkStart w:id="69" w:name="X93f250b8ac88c814716b20b105a72b2462a046b"/>
+    <w:p>
+      <w:pPr>
+        <w:pStyle w:val="Heading2"/>
+        <w:keepNext/>
+        <w:keepLines/>
+      </w:pPr>
+      <w:r>
+        <w:t xml:space="preserve">7. Impact</w:t>
+      </w:r>
+    </w:p>
+    <w:bookmarkStart w:id="64" w:name="impact-on-workers"/>
     <w:p>
       <w:pPr>
         <w:pStyle w:val="Heading3"/>
@@ -5584,7 +5728,7 @@
         <w:keepLines/>
       </w:pPr>
       <w:r>
-        <w:t xml:space="preserve">Wider economic and social impact</w:t>
+        <w:t xml:space="preserve">Impact on workers</w:t>
       </w:r>
     </w:p>
     <w:p>
@@ -5597,7 +5741,7 @@
         </w:numPr>
       </w:pPr>
       <w:r>
-        <w:t xml:space="preserve">Supports financial inclusion for workers participating in new forms of employment.</w:t>
+        <w:t xml:space="preserve">Gives financially active workers a fairer opportunity to demonstrate earning capacity.</w:t>
       </w:r>
     </w:p>
     <w:p>
@@ -5610,7 +5754,7 @@
         </w:numPr>
       </w:pPr>
       <w:r>
-        <w:t xml:space="preserve">Helps direct credit toward demonstrated economic activity that traditional documentation overlooks.</w:t>
+        <w:t xml:space="preserve">Reduces dependence on salary slips and previous formal loans as the only acceptable evidence.</w:t>
       </w:r>
     </w:p>
     <w:p>
@@ -5623,7 +5767,7 @@
         </w:numPr>
       </w:pPr>
       <w:r>
-        <w:t xml:space="preserve">Encourages responsible use of consented cash-flow data instead of intrusive or irrelevant personal signals.</w:t>
+        <w:t xml:space="preserve">Helps applicants understand which parts of their financial profile are strong, uncertain, or incomplete.</w:t>
       </w:r>
     </w:p>
     <w:p>
@@ -5636,11 +5780,139 @@
         </w:numPr>
       </w:pPr>
       <w:r>
+        <w:t xml:space="preserve">Can support access to emergency credit, productive assets, education, insurance, and income-smoothing products.</w:t>
+      </w:r>
+    </w:p>
+    <w:bookmarkEnd w:id="64"/>
+    <w:bookmarkStart w:id="65" w:name="impact-on-lenders"/>
+    <w:p>
+      <w:pPr>
+        <w:pStyle w:val="Heading3"/>
+        <w:keepNext/>
+        <w:keepLines/>
+      </w:pPr>
+      <w:r>
+        <w:t xml:space="preserve">Impact on lenders</w:t>
+      </w:r>
+    </w:p>
+    <w:p>
+      <w:pPr>
+        <w:pStyle w:val="Compact"/>
+        <w:widowControl/>
+        <w:numPr>
+          <w:ilvl w:val="0"/>
+          <w:numId w:val="1015"/>
+        </w:numPr>
+      </w:pPr>
+      <w:r>
+        <w:t xml:space="preserve">Expands the assessable applicant pool while preserving structured review.</w:t>
+      </w:r>
+    </w:p>
+    <w:p>
+      <w:pPr>
+        <w:pStyle w:val="Compact"/>
+        <w:widowControl/>
+        <w:numPr>
+          <w:ilvl w:val="0"/>
+          <w:numId w:val="1015"/>
+        </w:numPr>
+      </w:pPr>
+      <w:r>
+        <w:t xml:space="preserve">Reduces manual effort required to interpret multiple statements and irregular payment patterns.</w:t>
+      </w:r>
+    </w:p>
+    <w:p>
+      <w:pPr>
+        <w:pStyle w:val="Compact"/>
+        <w:widowControl/>
+        <w:numPr>
+          <w:ilvl w:val="0"/>
+          <w:numId w:val="1015"/>
+        </w:numPr>
+      </w:pPr>
+      <w:r>
+        <w:t xml:space="preserve">Provides consistent features, explanations, and data-quality warnings.</w:t>
+      </w:r>
+    </w:p>
+    <w:p>
+      <w:pPr>
+        <w:pStyle w:val="Compact"/>
+        <w:widowControl/>
+        <w:numPr>
+          <w:ilvl w:val="0"/>
+          <w:numId w:val="1015"/>
+        </w:numPr>
+      </w:pPr>
+      <w:r>
+        <w:t xml:space="preserve">Produces structured explanations and evidence that could support governance and customer communication when combined with production-grade persistent audit controls.</w:t>
+      </w:r>
+    </w:p>
+    <w:bookmarkEnd w:id="65"/>
+    <w:bookmarkStart w:id="66" w:name="wider-economic-and-social-impact"/>
+    <w:p>
+      <w:pPr>
+        <w:pStyle w:val="Heading3"/>
+        <w:keepNext/>
+        <w:keepLines/>
+      </w:pPr>
+      <w:r>
+        <w:t xml:space="preserve">Wider economic and social impact</w:t>
+      </w:r>
+    </w:p>
+    <w:p>
+      <w:pPr>
+        <w:pStyle w:val="Compact"/>
+        <w:widowControl/>
+        <w:numPr>
+          <w:ilvl w:val="0"/>
+          <w:numId w:val="1016"/>
+        </w:numPr>
+      </w:pPr>
+      <w:r>
+        <w:t xml:space="preserve">Supports financial inclusion for workers participating in new forms of employment.</w:t>
+      </w:r>
+    </w:p>
+    <w:p>
+      <w:pPr>
+        <w:pStyle w:val="Compact"/>
+        <w:widowControl/>
+        <w:numPr>
+          <w:ilvl w:val="0"/>
+          <w:numId w:val="1016"/>
+        </w:numPr>
+      </w:pPr>
+      <w:r>
+        <w:t xml:space="preserve">Helps direct credit toward demonstrated economic activity that traditional documentation overlooks.</w:t>
+      </w:r>
+    </w:p>
+    <w:p>
+      <w:pPr>
+        <w:pStyle w:val="Compact"/>
+        <w:widowControl/>
+        <w:numPr>
+          <w:ilvl w:val="0"/>
+          <w:numId w:val="1016"/>
+        </w:numPr>
+      </w:pPr>
+      <w:r>
+        <w:t xml:space="preserve">Encourages responsible use of consented cash-flow data instead of intrusive or irrelevant personal signals.</w:t>
+      </w:r>
+    </w:p>
+    <w:p>
+      <w:pPr>
+        <w:pStyle w:val="Compact"/>
+        <w:widowControl/>
+        <w:numPr>
+          <w:ilvl w:val="0"/>
+          <w:numId w:val="1016"/>
+        </w:numPr>
+      </w:pPr>
+      <w:r>
         <w:t xml:space="preserve">Can enable more suitable small-ticket credit products for variable-income households.</w:t>
       </w:r>
     </w:p>
-    <w:bookmarkEnd w:id="62"/>
-    <w:bookmarkStart w:id="63" w:name="impact-measurement"/>
+    <w:bookmarkEnd w:id="66"/>
+    <w:bookmarkStart w:id="67" w:name="impact-measurement"/>
     <w:p>
       <w:pPr>
         <w:pStyle w:val="Heading3"/>
@@ -6150,8 +6422,8 @@
         </w:tc>
       </w:tr>
     </w:tbl>
-    <w:bookmarkEnd w:id="63"/>
-    <w:bookmarkStart w:id="64" w:name="intended-outcome"/>
+    <w:bookmarkEnd w:id="67"/>
+    <w:bookmarkStart w:id="68" w:name="intended-outcome"/>
     <w:p>
       <w:pPr>
         <w:pStyle w:val="Heading3"/>
@@ -6183,9 +6455,9 @@
         </w:pict>
       </w:r>
     </w:p>
-    <w:bookmarkEnd w:id="64"/>
-    <w:bookmarkEnd w:id="65"/>
-    <w:bookmarkStart w:id="66" w:name="hackathon-mvp-success-criteria"/>
+    <w:bookmarkEnd w:id="68"/>
+    <w:bookmarkEnd w:id="69"/>
+    <w:bookmarkStart w:id="70" w:name="hackathon-mvp-success-criteria"/>
     <w:p>
       <w:pPr>
         <w:pStyle w:val="Heading2"/>
@@ -6212,7 +6484,7 @@
         <w:widowControl/>
         <w:numPr>
           <w:ilvl w:val="0"/>
-          <w:numId w:val="1015"/>
+          <w:numId w:val="1017"/>
         </w:numPr>
       </w:pPr>
       <w:r>
@@ -6225,7 +6497,7 @@
         <w:widowControl/>
         <w:numPr>
           <w:ilvl w:val="0"/>
-          <w:numId w:val="1015"/>
+          <w:numId w:val="1017"/>
         </w:numPr>
       </w:pPr>
       <w:r>
@@ -6238,7 +6510,7 @@
         <w:widowControl/>
         <w:numPr>
           <w:ilvl w:val="0"/>
-          <w:numId w:val="1015"/>
+          <w:numId w:val="1017"/>
         </w:numPr>
       </w:pPr>
       <w:r>
@@ -6251,7 +6523,7 @@
         <w:widowControl/>
         <w:numPr>
           <w:ilvl w:val="0"/>
-          <w:numId w:val="1015"/>
+          <w:numId w:val="1017"/>
         </w:numPr>
       </w:pPr>
       <w:r>
@@ -6264,7 +6536,7 @@
         <w:widowControl/>
         <w:numPr>
           <w:ilvl w:val="0"/>
-          <w:numId w:val="1015"/>
+          <w:numId w:val="1017"/>
         </w:numPr>
       </w:pPr>
       <w:r>
@@ -6277,15 +6549,15 @@
         <w:widowControl/>
         <w:numPr>
           <w:ilvl w:val="0"/>
-          <w:numId w:val="1015"/>
+          <w:numId w:val="1017"/>
         </w:numPr>
       </w:pPr>
       <w:r>
         <w:t xml:space="preserve">The lender can record a local MVP review decision separately from the calculated score.</w:t>
       </w:r>
     </w:p>
-    <w:bookmarkEnd w:id="66"/>
-    <w:bookmarkStart w:id="67" w:name="conclusion"/>
+    <w:bookmarkEnd w:id="70"/>
+    <w:bookmarkStart w:id="71" w:name="conclusion"/>
     <w:p>
       <w:pPr>
         <w:pStyle w:val="Heading2"/>
@@ -6316,168 +6588,8 @@
         <w:t xml:space="preserve">The immediate value is a clearer decision-support layer for non-salaried applicants. Production deployment would require consent-based integrations, persistent security and audit controls, lender-specific outcome calibration, regulatory review, fairness monitoring, and continued human oversight. Within its hackathon scope, EarnScore provides a credible foundation for making modern earning capacity visible without presenting a prototype score as an automatic lending decision.</w:t>
       </w:r>
     </w:p>
-    <w:bookmarkEnd w:id="67"/>
-    <w:bookmarkStart w:id="72" w:name="references"/>
-    <w:p>
-      <w:pPr>
-        <w:pStyle w:val="Heading2"/>
-        <w:keepNext/>
-        <w:keepLines/>
-      </w:pPr>
-      <w:r>
-        <w:t xml:space="preserve">References</w:t>
-      </w:r>
-    </w:p>
-    <w:p>
-      <w:pPr>
-        <w:pStyle w:val="Compact"/>
-        <w:widowControl/>
-        <w:numPr>
-          <w:ilvl w:val="0"/>
-          <w:numId w:val="1016"/>
-        </w:numPr>
-      </w:pPr>
-      <w:r>
-        <w:t xml:space="preserve">NITI Aayog,</w:t>
-      </w:r>
-      <w:r>
-        <w:t xml:space="preserve"> </w:t>
-      </w:r>
-      <w:r>
-        <w:rPr>
-          <w:i/>
-          <w:iCs/>
-        </w:rPr>
-        <w:t xml:space="preserve">India's Booming Gig and Platform Economy: Perspectives and Recommendations on the Future of Work</w:t>
-      </w:r>
-      <w:r>
-        <w:t xml:space="preserve">, June 2022.</w:t>
-      </w:r>
-      <w:r>
-        <w:t xml:space="preserve"> </w:t>
-      </w:r>
-      <w:hyperlink r:id="rId68">
-        <w:r>
-          <w:rPr>
-            <w:rStyle w:val="Hyperlink"/>
-          </w:rPr>
-          <w:t xml:space="preserve">https://www.niti.gov.in/sites/default/files/2022-06/Policy_Brief_India%27s_Booming_Gig_and_Platform_Economy_27062022.pdf</w:t>
-        </w:r>
-      </w:hyperlink>
-    </w:p>
-    <w:p>
-      <w:pPr>
-        <w:pStyle w:val="Compact"/>
-        <w:widowControl/>
-        <w:numPr>
-          <w:ilvl w:val="0"/>
-          <w:numId w:val="1016"/>
-        </w:numPr>
-      </w:pPr>
-      <w:r>
-        <w:t xml:space="preserve">Reserve Bank of India,</w:t>
-      </w:r>
-      <w:r>
-        <w:t xml:space="preserve"> </w:t>
-      </w:r>
-      <w:r>
-        <w:rPr>
-          <w:i/>
-          <w:iCs/>
-        </w:rPr>
-        <w:t xml:space="preserve">Non-Banking Financial Company – Account Aggregator (Reserve Bank) Directions, 2016</w:t>
-      </w:r>
-      <w:r>
-        <w:t xml:space="preserve">.</w:t>
-      </w:r>
-      <w:r>
-        <w:t xml:space="preserve"> </w:t>
-      </w:r>
-      <w:hyperlink r:id="rId69">
-        <w:r>
-          <w:rPr>
-            <w:rStyle w:val="Hyperlink"/>
-          </w:rPr>
-          <w:t xml:space="preserve">https://www.rbi.org.in/Scripts/NotificationUser.aspx?Id=10598</w:t>
-        </w:r>
-      </w:hyperlink>
-    </w:p>
-    <w:p>
-      <w:pPr>
-        <w:pStyle w:val="Compact"/>
-        <w:widowControl/>
-        <w:numPr>
-          <w:ilvl w:val="0"/>
-          <w:numId w:val="1016"/>
-        </w:numPr>
-      </w:pPr>
-      <w:r>
-        <w:t xml:space="preserve">World Bank,</w:t>
-      </w:r>
-      <w:r>
-        <w:t xml:space="preserve"> </w:t>
-      </w:r>
-      <w:r>
-        <w:rPr>
-          <w:i/>
-          <w:iCs/>
-        </w:rPr>
-        <w:t xml:space="preserve">The Global Findex Database 2021: Financial Inclusion, Digital Payments, and Resilience in the Age of COVID-19</w:t>
-      </w:r>
-      <w:r>
-        <w:t xml:space="preserve">, 2022.</w:t>
-      </w:r>
-      <w:r>
-        <w:t xml:space="preserve"> </w:t>
-      </w:r>
-      <w:hyperlink r:id="rId70">
-        <w:r>
-          <w:rPr>
-            <w:rStyle w:val="Hyperlink"/>
-          </w:rPr>
-          <w:t xml:space="preserve">https://www.worldbank.org/en/publication/globalfindex</w:t>
-        </w:r>
-      </w:hyperlink>
-    </w:p>
-    <w:p>
-      <w:pPr>
-        <w:pStyle w:val="Compact"/>
-        <w:widowControl/>
-        <w:numPr>
-          <w:ilvl w:val="0"/>
-          <w:numId w:val="1016"/>
-        </w:numPr>
-      </w:pPr>
-      <w:r>
-        <w:t xml:space="preserve">International Labour Organization,</w:t>
-      </w:r>
-      <w:r>
-        <w:t xml:space="preserve"> </w:t>
-      </w:r>
-      <w:r>
-        <w:rPr>
-          <w:i/>
-          <w:iCs/>
-        </w:rPr>
-        <w:t xml:space="preserve">World Employment and Social Outlook 2021: The Role of Digital Labour Platforms in Transforming the World of Work</w:t>
-      </w:r>
-      <w:r>
-        <w:t xml:space="preserve">, 2021.</w:t>
-      </w:r>
-      <w:r>
-        <w:t xml:space="preserve"> </w:t>
-      </w:r>
-      <w:hyperlink r:id="rId71">
-        <w:r>
-          <w:rPr>
-            <w:rStyle w:val="Hyperlink"/>
-          </w:rPr>
-          <w:t xml:space="preserve">https://www.ilo.org/publications/flagship-reports/role-digital-labour-platforms-transforming-world-work</w:t>
-        </w:r>
-      </w:hyperlink>
-    </w:p>
+    <w:bookmarkEnd w:id="71"/>
     <w:bookmarkEnd w:id="72"/>
-    <w:bookmarkEnd w:id="73"/>
     <w:sectPr>
       <w:headerReference w:type="default" r:id="rId9"/>
       <w:footerReference w:type="default" r:id="rId10"/>
@@ -6521,7 +6633,7 @@
         <w:color w:val="667085"/>
         <w:sz w:val="15"/>
       </w:rPr>
-      <w:t xml:space="preserve">  •  EarnScore Research Submission</w:t>
+      <w:t xml:space="preserve">  •  Hackathon Submission</w:t>
     </w:r>
   </w:p>
 </w:ftr>
@@ -6645,6 +6757,82 @@
       </w:pPr>
     </w:lvl>
   </w:abstractNum>
+  <w:abstractNum w:abstractNumId="991">
+    <w:nsid w:val="0000A991"/>
+    <w:multiLevelType w:val="multilevel"/>
+    <w:lvl w:ilvl="0">
+      <w:numFmt w:val="bullet"/>
+      <w:lvlText w:val="•"/>
+      <w:lvlJc w:val="left"/>
+      <w:pPr>
+        <w:ind w:left="720" w:hanging="480"/>
+      </w:pPr>
+    </w:lvl>
+    <w:lvl w:ilvl="1">
+      <w:numFmt w:val="bullet"/>
+      <w:lvlText w:val="–"/>
+      <w:lvlJc w:val="left"/>
+      <w:pPr>
+        <w:ind w:left="1440" w:hanging="480"/>
+      </w:pPr>
+    </w:lvl>
+    <w:lvl w:ilvl="2">
+      <w:numFmt w:val="bullet"/>
+      <w:lvlText w:val="•"/>
+      <w:lvlJc w:val="left"/>
+      <w:pPr>
+        <w:ind w:left="2160" w:hanging="480"/>
+      </w:pPr>
+    </w:lvl>
+    <w:lvl w:ilvl="3">
+      <w:numFmt w:val="bullet"/>
+      <w:lvlText w:val="–"/>
+      <w:lvlJc w:val="left"/>
+      <w:pPr>
+        <w:ind w:left="2880" w:hanging="480"/>
+      </w:pPr>
+    </w:lvl>
+    <w:lvl w:ilvl="4">
+      <w:numFmt w:val="bullet"/>
+      <w:lvlText w:val="•"/>
+      <w:lvlJc w:val="left"/>
+      <w:pPr>
+        <w:ind w:left="3600" w:hanging="480"/>
+      </w:pPr>
+    </w:lvl>
+    <w:lvl w:ilvl="5">
+      <w:numFmt w:val="bullet"/>
+      <w:lvlText w:val="–"/>
+      <w:lvlJc w:val="left"/>
+      <w:pPr>
+        <w:ind w:left="4320" w:hanging="480"/>
+      </w:pPr>
+    </w:lvl>
+    <w:lvl w:ilvl="6">
+      <w:numFmt w:val="bullet"/>
+      <w:lvlText w:val="•"/>
+      <w:lvlJc w:val="left"/>
+      <w:pPr>
+        <w:ind w:left="5040" w:hanging="480"/>
+      </w:pPr>
+    </w:lvl>
+    <w:lvl w:ilvl="7">
+      <w:numFmt w:val="bullet"/>
+      <w:lvlText w:val="–"/>
+      <w:lvlJc w:val="left"/>
+      <w:pPr>
+        <w:ind w:left="5760" w:hanging="480"/>
+      </w:pPr>
+    </w:lvl>
+    <w:lvl w:ilvl="8">
+      <w:numFmt w:val="bullet"/>
+      <w:lvlText w:val="•"/>
+      <w:lvlJc w:val="left"/>
+      <w:pPr>
+        <w:ind w:left="6480" w:hanging="480"/>
+      </w:pPr>
+    </w:lvl>
+  </w:abstractNum>
   <w:abstractNum w:abstractNumId="99411">
     <w:nsid w:val="00A99411"/>
     <w:multiLevelType w:val="multilevel"/>
@@ -6730,86 +6918,13 @@
       </w:pPr>
     </w:lvl>
   </w:abstractNum>
-  <w:abstractNum w:abstractNumId="991">
-    <w:nsid w:val="0000A991"/>
-    <w:multiLevelType w:val="multilevel"/>
-    <w:lvl w:ilvl="0">
-      <w:numFmt w:val="bullet"/>
-      <w:lvlText w:val="•"/>
-      <w:lvlJc w:val="left"/>
-      <w:pPr>
-        <w:ind w:left="720" w:hanging="480"/>
-      </w:pPr>
-    </w:lvl>
-    <w:lvl w:ilvl="1">
-      <w:numFmt w:val="bullet"/>
-      <w:lvlText w:val="–"/>
-      <w:lvlJc w:val="left"/>
-      <w:pPr>
-        <w:ind w:left="1440" w:hanging="480"/>
-      </w:pPr>
-    </w:lvl>
-    <w:lvl w:ilvl="2">
-      <w:numFmt w:val="bullet"/>
-      <w:lvlText w:val="•"/>
-      <w:lvlJc w:val="left"/>
-      <w:pPr>
-        <w:ind w:left="2160" w:hanging="480"/>
-      </w:pPr>
-    </w:lvl>
-    <w:lvl w:ilvl="3">
-      <w:numFmt w:val="bullet"/>
-      <w:lvlText w:val="–"/>
-      <w:lvlJc w:val="left"/>
-      <w:pPr>
-        <w:ind w:left="2880" w:hanging="480"/>
-      </w:pPr>
-    </w:lvl>
-    <w:lvl w:ilvl="4">
-      <w:numFmt w:val="bullet"/>
-      <w:lvlText w:val="•"/>
-      <w:lvlJc w:val="left"/>
-      <w:pPr>
-        <w:ind w:left="3600" w:hanging="480"/>
-      </w:pPr>
-    </w:lvl>
-    <w:lvl w:ilvl="5">
-      <w:numFmt w:val="bullet"/>
-      <w:lvlText w:val="–"/>
-      <w:lvlJc w:val="left"/>
-      <w:pPr>
-        <w:ind w:left="4320" w:hanging="480"/>
-      </w:pPr>
-    </w:lvl>
-    <w:lvl w:ilvl="6">
-      <w:numFmt w:val="bullet"/>
-      <w:lvlText w:val="•"/>
-      <w:lvlJc w:val="left"/>
-      <w:pPr>
-        <w:ind w:left="5040" w:hanging="480"/>
-      </w:pPr>
-    </w:lvl>
-    <w:lvl w:ilvl="7">
-      <w:numFmt w:val="bullet"/>
-      <w:lvlText w:val="–"/>
-      <w:lvlJc w:val="left"/>
-      <w:pPr>
-        <w:ind w:left="5760" w:hanging="480"/>
-      </w:pPr>
-    </w:lvl>
-    <w:lvl w:ilvl="8">
-      <w:numFmt w:val="bullet"/>
-      <w:lvlText w:val="•"/>
-      <w:lvlJc w:val="left"/>
-      <w:pPr>
-        <w:ind w:left="6480" w:hanging="480"/>
-      </w:pPr>
-    </w:lvl>
-  </w:abstractNum>
   <w:num w:numId="1000">
     <w:abstractNumId w:val="990"/>
   </w:num>
   <w:num w:numId="1001">
+    <w:abstractNumId w:val="991"/>
+  </w:num>
+  <w:num w:numId="1002">
     <w:abstractNumId w:val="99411"/>
     <w:lvlOverride w:ilvl="0">
       <w:startOverride w:val="1"/>
@@ -6839,13 +6954,13 @@
       <w:startOverride w:val="1"/>
     </w:lvlOverride>
   </w:num>
-  <w:num w:numId="1002">
-    <w:abstractNumId w:val="991"/>
-  </w:num>
   <w:num w:numId="1003">
     <w:abstractNumId w:val="991"/>
   </w:num>
   <w:num w:numId="1004">
+    <w:abstractNumId w:val="991"/>
+  </w:num>
+  <w:num w:numId="1005">
     <w:abstractNumId w:val="99411"/>
     <w:lvlOverride w:ilvl="0">
       <w:startOverride w:val="1"/>
@@ -6875,9 +6990,6 @@
       <w:startOverride w:val="1"/>
     </w:lvlOverride>
   </w:num>
-  <w:num w:numId="1005">
-    <w:abstractNumId w:val="991"/>
-  </w:num>
   <w:num w:numId="1006">
     <w:abstractNumId w:val="991"/>
   </w:num>
@@ -6894,6 +7006,9 @@
     <w:abstractNumId w:val="991"/>
   </w:num>
   <w:num w:numId="1011">
+    <w:abstractNumId w:val="991"/>
+  </w:num>
+  <w:num w:numId="1012">
     <w:abstractNumId w:val="99411"/>
     <w:lvlOverride w:ilvl="0">
       <w:startOverride w:val="1"/>
@@ -6923,16 +7038,7 @@
       <w:startOverride w:val="1"/>
     </w:lvlOverride>
   </w:num>
-  <w:num w:numId="1012">
-    <w:abstractNumId w:val="991"/>
-  </w:num>
   <w:num w:numId="1013">
-    <w:abstractNumId w:val="991"/>
-  </w:num>
-  <w:num w:numId="1014">
-    <w:abstractNumId w:val="991"/>
-  </w:num>
-  <w:num w:numId="1015">
     <w:abstractNumId w:val="99411"/>
     <w:lvlOverride w:ilvl="0">
       <w:startOverride w:val="1"/>
@@ -6962,7 +7068,16 @@
       <w:startOverride w:val="1"/>
     </w:lvlOverride>
   </w:num>
+  <w:num w:numId="1014">
+    <w:abstractNumId w:val="991"/>
+  </w:num>
+  <w:num w:numId="1015">
+    <w:abstractNumId w:val="991"/>
+  </w:num>
   <w:num w:numId="1016">
+    <w:abstractNumId w:val="991"/>
+  </w:num>
+  <w:num w:numId="1017">
     <w:abstractNumId w:val="99411"/>
     <w:lvlOverride w:ilvl="0">
       <w:startOverride w:val="1"/>

</xml_diff>